<commit_message>
update pitch deck link
</commit_message>
<xml_diff>
--- a/risk-vs-reward/downloads/FullFormatBible.docx
+++ b/risk-vs-reward/downloads/FullFormatBible.docx
@@ -4,7 +4,9 @@
   <w:body>
     <w:p>
       <w:pPr>
-        <w:rPr>
+        <w:jc w:val="center"/>
+        <w:rPr>
+          <w:rFonts w:ascii="Helvetica Neue" w:hAnsi="Helvetica Neue"/>
           <w:b/>
           <w:bCs/>
           <w:sz w:val="28"/>
@@ -13,6 +15,7 @@
       </w:pPr>
       <w:r>
         <w:rPr>
+          <w:rFonts w:ascii="Helvetica Neue" w:hAnsi="Helvetica Neue"/>
           <w:b/>
           <w:bCs/>
           <w:sz w:val="28"/>
@@ -20,483 +23,531 @@
         </w:rPr>
         <w:t>RISK vs. REWARD</w:t>
       </w:r>
-    </w:p>
-    <w:p>
-      <w:pPr>
-        <w:rPr>
-          <w:rFonts w:ascii="Arial" w:hAnsi="Arial" w:cs="Arial"/>
-          <w:sz w:val="22"/>
-          <w:szCs w:val="22"/>
-        </w:rPr>
-      </w:pPr>
-      <w:r>
-        <w:rPr>
-          <w:rFonts w:ascii="Arial" w:hAnsi="Arial" w:cs="Arial"/>
+      <w:r>
+        <w:rPr>
+          <w:rFonts w:ascii="Helvetica Neue" w:hAnsi="Helvetica Neue"/>
           <w:b/>
           <w:bCs/>
-          <w:sz w:val="22"/>
-          <w:szCs w:val="22"/>
-        </w:rPr>
-        <w:t>How much would you bet you're right?</w:t>
-      </w:r>
-    </w:p>
-    <w:p>
-      <w:pPr>
-        <w:rPr>
-          <w:rFonts w:ascii="Arial" w:hAnsi="Arial" w:cs="Arial"/>
-          <w:sz w:val="22"/>
-          <w:szCs w:val="22"/>
-        </w:rPr>
-      </w:pPr>
-      <w:r>
-        <w:rPr>
-          <w:rFonts w:ascii="Arial" w:hAnsi="Arial" w:cs="Arial"/>
+          <w:sz w:val="28"/>
+          <w:szCs w:val="28"/>
+          <w:shd w:val="clear" w:color="auto" w:fill="F9F9F9"/>
+          <w:lang w:val="de-DE"/>
+        </w:rPr>
+        <w:t xml:space="preserve"> </w:t>
+      </w:r>
+      <w:r>
+        <w:rPr>
+          <w:rFonts w:ascii="Helvetica Neue" w:hAnsi="Helvetica Neue"/>
           <w:b/>
           <w:bCs/>
-          <w:sz w:val="22"/>
-          <w:szCs w:val="22"/>
-        </w:rPr>
-        <w:t>1-Hour Studio Game Show</w:t>
-      </w:r>
-      <w:r>
-        <w:rPr>
-          <w:rFonts w:ascii="Arial" w:hAnsi="Arial" w:cs="Arial"/>
-          <w:sz w:val="22"/>
-          <w:szCs w:val="22"/>
-        </w:rPr>
-        <w:br/>
-      </w:r>
-      <w:r>
-        <w:rPr>
-          <w:rFonts w:ascii="Arial" w:hAnsi="Arial" w:cs="Arial"/>
+          <w:sz w:val="28"/>
+          <w:szCs w:val="28"/>
+          <w:shd w:val="clear" w:color="auto" w:fill="F9F9F9"/>
+        </w:rPr>
+        <w:t>–</w:t>
+      </w:r>
+      <w:r>
+        <w:rPr>
+          <w:rFonts w:ascii="Helvetica Neue" w:hAnsi="Helvetica Neue"/>
           <w:b/>
           <w:bCs/>
-          <w:sz w:val="22"/>
-          <w:szCs w:val="22"/>
-        </w:rPr>
-        <w:t>Players: Solo Contestants or Couples</w:t>
-      </w:r>
-      <w:r>
-        <w:rPr>
-          <w:rFonts w:ascii="Arial" w:hAnsi="Arial" w:cs="Arial"/>
-          <w:sz w:val="22"/>
-          <w:szCs w:val="22"/>
-        </w:rPr>
-        <w:br/>
-      </w:r>
-      <w:r>
-        <w:rPr>
-          <w:rFonts w:ascii="Arial" w:hAnsi="Arial" w:cs="Arial"/>
+          <w:sz w:val="28"/>
+          <w:szCs w:val="28"/>
+          <w:shd w:val="clear" w:color="auto" w:fill="F9F9F9"/>
+        </w:rPr>
+        <w:t xml:space="preserve"> Full Format Bible</w:t>
+      </w:r>
+    </w:p>
+    <w:p>
+      <w:pPr>
+        <w:rPr>
+          <w:rFonts w:ascii="Helvetica Neue" w:hAnsi="Helvetica Neue" w:cs="Arial"/>
+          <w:i/>
+          <w:iCs/>
+          <w:sz w:val="22"/>
+          <w:szCs w:val="22"/>
+        </w:rPr>
+      </w:pPr>
+      <w:r>
+        <w:rPr>
+          <w:rFonts w:ascii="Helvetica Neue" w:hAnsi="Helvetica Neue" w:cs="Arial"/>
           <w:b/>
           <w:bCs/>
-          <w:sz w:val="22"/>
-          <w:szCs w:val="22"/>
-        </w:rPr>
-        <w:t xml:space="preserve">Prize Range: $0.01 </w:t>
-      </w:r>
-      <w:r>
-        <w:rPr>
-          <w:rFonts w:ascii="Arial" w:hAnsi="Arial" w:cs="Arial"/>
+          <w:i/>
+          <w:iCs/>
+          <w:sz w:val="22"/>
+          <w:szCs w:val="22"/>
+        </w:rPr>
+        <w:t>How much would you bet you're right?</w:t>
+      </w:r>
+    </w:p>
+    <w:p>
+      <w:pPr>
+        <w:rPr>
+          <w:rFonts w:ascii="Helvetica Neue" w:hAnsi="Helvetica Neue" w:cs="Arial"/>
+          <w:sz w:val="22"/>
+          <w:szCs w:val="22"/>
+        </w:rPr>
+      </w:pPr>
+      <w:r>
+        <w:rPr>
+          <w:rFonts w:ascii="Helvetica Neue" w:hAnsi="Helvetica Neue" w:cs="Arial"/>
           <w:b/>
           <w:bCs/>
           <w:sz w:val="22"/>
           <w:szCs w:val="22"/>
         </w:rPr>
-        <w:t>to</w:t>
-      </w:r>
-      <w:r>
-        <w:rPr>
-          <w:rFonts w:ascii="Arial" w:hAnsi="Arial" w:cs="Arial"/>
+        <w:t>1-Hour Studio Game Show</w:t>
+      </w:r>
+      <w:r>
+        <w:rPr>
+          <w:rFonts w:ascii="Helvetica Neue" w:hAnsi="Helvetica Neue" w:cs="Arial"/>
+          <w:sz w:val="22"/>
+          <w:szCs w:val="22"/>
+        </w:rPr>
+        <w:br/>
+      </w:r>
+      <w:r>
+        <w:rPr>
+          <w:rFonts w:ascii="Helvetica Neue" w:hAnsi="Helvetica Neue" w:cs="Arial"/>
           <w:b/>
           <w:bCs/>
           <w:sz w:val="22"/>
           <w:szCs w:val="22"/>
         </w:rPr>
-        <w:t xml:space="preserve"> $1,000,000</w:t>
-      </w:r>
-    </w:p>
-    <w:p>
-      <w:pPr>
-        <w:rPr>
-          <w:rFonts w:ascii="Arial" w:hAnsi="Arial" w:cs="Arial"/>
+        <w:t>Players: Solo Contestants or Couples</w:t>
+      </w:r>
+      <w:r>
+        <w:rPr>
+          <w:rFonts w:ascii="Helvetica Neue" w:hAnsi="Helvetica Neue" w:cs="Arial"/>
+          <w:sz w:val="22"/>
+          <w:szCs w:val="22"/>
+        </w:rPr>
+        <w:br/>
+      </w:r>
+      <w:r>
+        <w:rPr>
+          <w:rFonts w:ascii="Helvetica Neue" w:hAnsi="Helvetica Neue" w:cs="Arial"/>
           <w:b/>
           <w:bCs/>
           <w:sz w:val="22"/>
           <w:szCs w:val="22"/>
         </w:rPr>
-      </w:pPr>
-      <w:r>
-        <w:rPr>
-          <w:rFonts w:ascii="Arial" w:hAnsi="Arial" w:cs="Arial"/>
+        <w:t xml:space="preserve">Prize Range: $0.01 </w:t>
+      </w:r>
+      <w:r>
+        <w:rPr>
+          <w:rFonts w:ascii="Helvetica Neue" w:hAnsi="Helvetica Neue" w:cs="Arial"/>
           <w:b/>
           <w:bCs/>
           <w:sz w:val="22"/>
           <w:szCs w:val="22"/>
         </w:rPr>
-        <w:t>LOGLINE</w:t>
-      </w:r>
-    </w:p>
-    <w:p>
-      <w:pPr>
-        <w:rPr>
-          <w:rFonts w:ascii="Arial" w:hAnsi="Arial" w:cs="Arial"/>
-          <w:sz w:val="22"/>
-          <w:szCs w:val="22"/>
-        </w:rPr>
-      </w:pPr>
-      <w:r>
-        <w:rPr>
-          <w:rFonts w:ascii="Arial" w:hAnsi="Arial" w:cs="Arial"/>
-          <w:sz w:val="22"/>
-          <w:szCs w:val="22"/>
-        </w:rPr>
-        <w:t xml:space="preserve">Contestants answer trivia questions—but </w:t>
-      </w:r>
-      <w:r>
-        <w:rPr>
-          <w:rFonts w:ascii="Arial" w:hAnsi="Arial" w:cs="Arial"/>
-          <w:sz w:val="22"/>
-          <w:szCs w:val="22"/>
-        </w:rPr>
-        <w:t>before locking in an answer,</w:t>
-      </w:r>
-      <w:r>
-        <w:rPr>
-          <w:rFonts w:ascii="Arial" w:hAnsi="Arial" w:cs="Arial"/>
-          <w:sz w:val="22"/>
-          <w:szCs w:val="22"/>
-        </w:rPr>
-        <w:t xml:space="preserve"> they must decide how much they trust their choice. That decision determines </w:t>
-      </w:r>
-      <w:r>
-        <w:rPr>
-          <w:rFonts w:ascii="Arial" w:hAnsi="Arial" w:cs="Arial"/>
-          <w:sz w:val="22"/>
-          <w:szCs w:val="22"/>
-        </w:rPr>
-        <w:t>how much they can win or lose</w:t>
-      </w:r>
-      <w:r>
-        <w:rPr>
-          <w:rFonts w:ascii="Arial" w:hAnsi="Arial" w:cs="Arial"/>
-          <w:sz w:val="22"/>
-          <w:szCs w:val="22"/>
-        </w:rPr>
-        <w:t xml:space="preserve"> and permanently shapes their path to a $1,000,000 prize.</w:t>
-      </w:r>
-    </w:p>
-    <w:p>
-      <w:pPr>
-        <w:rPr>
-          <w:rFonts w:ascii="Arial" w:hAnsi="Arial" w:cs="Arial"/>
+        <w:t>to</w:t>
+      </w:r>
+      <w:r>
+        <w:rPr>
+          <w:rFonts w:ascii="Helvetica Neue" w:hAnsi="Helvetica Neue" w:cs="Arial"/>
           <w:b/>
           <w:bCs/>
           <w:sz w:val="22"/>
           <w:szCs w:val="22"/>
         </w:rPr>
-      </w:pPr>
-      <w:r>
-        <w:rPr>
-          <w:rFonts w:ascii="Arial" w:hAnsi="Arial" w:cs="Arial"/>
+        <w:t xml:space="preserve"> $1,000,000</w:t>
+      </w:r>
+    </w:p>
+    <w:p>
+      <w:pPr>
+        <w:rPr>
+          <w:rFonts w:ascii="Helvetica Neue" w:hAnsi="Helvetica Neue" w:cs="Arial"/>
           <w:b/>
           <w:bCs/>
           <w:sz w:val="22"/>
           <w:szCs w:val="22"/>
         </w:rPr>
-        <w:t>CORE PREMISE</w:t>
-      </w:r>
-    </w:p>
-    <w:p>
-      <w:pPr>
-        <w:rPr>
-          <w:rFonts w:ascii="Arial" w:hAnsi="Arial" w:cs="Arial"/>
-          <w:sz w:val="22"/>
-          <w:szCs w:val="22"/>
-        </w:rPr>
-      </w:pPr>
-      <w:r>
-        <w:rPr>
-          <w:rFonts w:ascii="Arial" w:hAnsi="Arial" w:cs="Arial"/>
-          <w:sz w:val="22"/>
-          <w:szCs w:val="22"/>
-        </w:rPr>
-        <w:t>RISK vs. REWARD is a trivia game built around one idea:</w:t>
-      </w:r>
-    </w:p>
-    <w:p>
-      <w:pPr>
-        <w:ind w:left="720"/>
-        <w:rPr>
-          <w:rFonts w:ascii="Arial" w:hAnsi="Arial" w:cs="Arial"/>
-          <w:sz w:val="22"/>
-          <w:szCs w:val="22"/>
-        </w:rPr>
-      </w:pPr>
-      <w:r>
-        <w:rPr>
-          <w:rFonts w:ascii="Arial" w:hAnsi="Arial" w:cs="Arial"/>
-          <w:sz w:val="22"/>
-          <w:szCs w:val="22"/>
-        </w:rPr>
-        <w:t>Confidence is currency.</w:t>
-      </w:r>
-    </w:p>
-    <w:p>
-      <w:pPr>
-        <w:rPr>
-          <w:rFonts w:ascii="Arial" w:hAnsi="Arial" w:cs="Arial"/>
-          <w:sz w:val="22"/>
-          <w:szCs w:val="22"/>
-        </w:rPr>
-      </w:pPr>
-      <w:r>
-        <w:rPr>
-          <w:rFonts w:ascii="Arial" w:hAnsi="Arial" w:cs="Arial"/>
-          <w:sz w:val="22"/>
-          <w:szCs w:val="22"/>
-        </w:rPr>
-        <w:t>After seeing a question and its possible answers</w:t>
-      </w:r>
-      <w:r>
-        <w:rPr>
-          <w:rFonts w:ascii="Arial" w:hAnsi="Arial" w:cs="Arial"/>
-          <w:sz w:val="22"/>
-          <w:szCs w:val="22"/>
-        </w:rPr>
-        <w:t xml:space="preserve">, contestants </w:t>
-      </w:r>
-      <w:r>
-        <w:rPr>
-          <w:rFonts w:ascii="Arial" w:hAnsi="Arial" w:cs="Arial"/>
-          <w:sz w:val="22"/>
-          <w:szCs w:val="22"/>
-        </w:rPr>
-        <w:t xml:space="preserve">must </w:t>
-      </w:r>
-      <w:r>
-        <w:rPr>
-          <w:rFonts w:ascii="Arial" w:hAnsi="Arial" w:cs="Arial"/>
-          <w:sz w:val="22"/>
-          <w:szCs w:val="22"/>
-        </w:rPr>
-        <w:t xml:space="preserve">decide how much they believe in </w:t>
-      </w:r>
-      <w:r>
-        <w:rPr>
-          <w:rFonts w:ascii="Arial" w:hAnsi="Arial" w:cs="Arial"/>
-          <w:sz w:val="22"/>
-          <w:szCs w:val="22"/>
-        </w:rPr>
-        <w:t>their choice</w:t>
-      </w:r>
-      <w:r>
-        <w:rPr>
-          <w:rFonts w:ascii="Arial" w:hAnsi="Arial" w:cs="Arial"/>
-          <w:sz w:val="22"/>
-          <w:szCs w:val="22"/>
-        </w:rPr>
-        <w:t>. That decision is not just a wager—it reshapes their entire financial trajectory through the game.</w:t>
-      </w:r>
-    </w:p>
-    <w:p>
-      <w:pPr>
-        <w:rPr>
-          <w:rFonts w:ascii="Arial" w:hAnsi="Arial" w:cs="Arial"/>
+      </w:pPr>
+      <w:r>
+        <w:rPr>
+          <w:rFonts w:ascii="Helvetica Neue" w:hAnsi="Helvetica Neue" w:cs="Arial"/>
           <w:b/>
           <w:bCs/>
           <w:sz w:val="22"/>
           <w:szCs w:val="22"/>
         </w:rPr>
-      </w:pPr>
-      <w:r>
-        <w:rPr>
-          <w:rFonts w:ascii="Arial" w:hAnsi="Arial" w:cs="Arial"/>
+        <w:t>LOGLINE</w:t>
+      </w:r>
+    </w:p>
+    <w:p>
+      <w:pPr>
+        <w:rPr>
+          <w:rFonts w:ascii="Helvetica Neue" w:hAnsi="Helvetica Neue" w:cs="Arial"/>
+          <w:sz w:val="22"/>
+          <w:szCs w:val="22"/>
+        </w:rPr>
+      </w:pPr>
+      <w:r>
+        <w:rPr>
+          <w:rFonts w:ascii="Helvetica Neue" w:hAnsi="Helvetica Neue" w:cs="Arial"/>
+          <w:sz w:val="22"/>
+          <w:szCs w:val="22"/>
+        </w:rPr>
+        <w:t xml:space="preserve">Contestants answer trivia questions—but </w:t>
+      </w:r>
+      <w:r>
+        <w:rPr>
+          <w:rFonts w:ascii="Helvetica Neue" w:hAnsi="Helvetica Neue" w:cs="Arial"/>
+          <w:sz w:val="22"/>
+          <w:szCs w:val="22"/>
+        </w:rPr>
+        <w:t>before locking in an answer,</w:t>
+      </w:r>
+      <w:r>
+        <w:rPr>
+          <w:rFonts w:ascii="Helvetica Neue" w:hAnsi="Helvetica Neue" w:cs="Arial"/>
+          <w:sz w:val="22"/>
+          <w:szCs w:val="22"/>
+        </w:rPr>
+        <w:t xml:space="preserve"> they must decide how much they trust their choice. That decision determines </w:t>
+      </w:r>
+      <w:r>
+        <w:rPr>
+          <w:rFonts w:ascii="Helvetica Neue" w:hAnsi="Helvetica Neue" w:cs="Arial"/>
+          <w:sz w:val="22"/>
+          <w:szCs w:val="22"/>
+        </w:rPr>
+        <w:t>how much they can win or lose</w:t>
+      </w:r>
+      <w:r>
+        <w:rPr>
+          <w:rFonts w:ascii="Helvetica Neue" w:hAnsi="Helvetica Neue" w:cs="Arial"/>
+          <w:sz w:val="22"/>
+          <w:szCs w:val="22"/>
+        </w:rPr>
+        <w:t xml:space="preserve"> and permanently shapes their path to a $1,000,000 prize.</w:t>
+      </w:r>
+    </w:p>
+    <w:p>
+      <w:pPr>
+        <w:rPr>
+          <w:rFonts w:ascii="Helvetica Neue" w:hAnsi="Helvetica Neue" w:cs="Arial"/>
           <w:b/>
           <w:bCs/>
           <w:sz w:val="22"/>
           <w:szCs w:val="22"/>
         </w:rPr>
-        <w:t>GAME STRUCTURE</w:t>
-      </w:r>
-    </w:p>
-    <w:p>
-      <w:pPr>
-        <w:ind w:left="720"/>
-        <w:rPr>
-          <w:rFonts w:ascii="Arial" w:hAnsi="Arial" w:cs="Arial"/>
-          <w:sz w:val="22"/>
-          <w:szCs w:val="22"/>
-        </w:rPr>
-      </w:pPr>
-      <w:r>
-        <w:rPr>
-          <w:rFonts w:ascii="Arial" w:hAnsi="Arial" w:cs="Arial"/>
-          <w:sz w:val="22"/>
-          <w:szCs w:val="22"/>
-        </w:rPr>
-        <w:t xml:space="preserve">• </w:t>
-      </w:r>
-      <w:r>
-        <w:rPr>
-          <w:rFonts w:ascii="Arial" w:hAnsi="Arial" w:cs="Arial"/>
-          <w:sz w:val="22"/>
-          <w:szCs w:val="22"/>
-        </w:rPr>
-        <w:t xml:space="preserve">12-question single-contestant game (studio-based) </w:t>
-      </w:r>
-      <w:r>
-        <w:rPr>
-          <w:rFonts w:ascii="Arial" w:hAnsi="Arial" w:cs="Arial"/>
-          <w:sz w:val="22"/>
-          <w:szCs w:val="22"/>
-        </w:rPr>
-        <w:br/>
-      </w:r>
-      <w:r>
-        <w:rPr>
-          <w:rFonts w:ascii="Arial" w:hAnsi="Arial" w:cs="Arial"/>
-          <w:sz w:val="22"/>
-          <w:szCs w:val="22"/>
-        </w:rPr>
-        <w:t xml:space="preserve">• </w:t>
-      </w:r>
-      <w:r>
-        <w:rPr>
-          <w:rFonts w:ascii="Arial" w:hAnsi="Arial" w:cs="Arial"/>
-          <w:sz w:val="22"/>
-          <w:szCs w:val="22"/>
-        </w:rPr>
-        <w:t xml:space="preserve">Contestants choose a category before each question </w:t>
-      </w:r>
-      <w:r>
-        <w:rPr>
-          <w:rFonts w:ascii="Arial" w:hAnsi="Arial" w:cs="Arial"/>
-          <w:sz w:val="22"/>
-          <w:szCs w:val="22"/>
-        </w:rPr>
-        <w:br/>
-      </w:r>
-      <w:r>
-        <w:rPr>
-          <w:rFonts w:ascii="Arial" w:hAnsi="Arial" w:cs="Arial"/>
-          <w:sz w:val="22"/>
-          <w:szCs w:val="22"/>
-        </w:rPr>
-        <w:t xml:space="preserve">• </w:t>
-      </w:r>
-      <w:r>
-        <w:rPr>
-          <w:rFonts w:ascii="Arial" w:hAnsi="Arial" w:cs="Arial"/>
-          <w:sz w:val="22"/>
-          <w:szCs w:val="22"/>
-        </w:rPr>
-        <w:t xml:space="preserve">Each question is multiple choice (4 answers) </w:t>
-      </w:r>
-      <w:r>
-        <w:rPr>
-          <w:rFonts w:ascii="Arial" w:hAnsi="Arial" w:cs="Arial"/>
-          <w:sz w:val="22"/>
-          <w:szCs w:val="22"/>
-        </w:rPr>
-        <w:br/>
-      </w:r>
-      <w:r>
-        <w:rPr>
-          <w:rFonts w:ascii="Arial" w:hAnsi="Arial" w:cs="Arial"/>
-          <w:sz w:val="22"/>
-          <w:szCs w:val="22"/>
-        </w:rPr>
-        <w:t xml:space="preserve">• </w:t>
-      </w:r>
-      <w:r>
-        <w:rPr>
-          <w:rFonts w:ascii="Arial" w:hAnsi="Arial" w:cs="Arial"/>
-          <w:sz w:val="22"/>
-          <w:szCs w:val="22"/>
-        </w:rPr>
-        <w:t xml:space="preserve">Contestants answer first, then set confidence via slider </w:t>
-      </w:r>
-      <w:r>
-        <w:rPr>
-          <w:rFonts w:ascii="Arial" w:hAnsi="Arial" w:cs="Arial"/>
-          <w:sz w:val="22"/>
-          <w:szCs w:val="22"/>
-        </w:rPr>
-        <w:br/>
-      </w:r>
-      <w:r>
-        <w:rPr>
-          <w:rFonts w:ascii="Arial" w:hAnsi="Arial" w:cs="Arial"/>
-          <w:sz w:val="22"/>
-          <w:szCs w:val="22"/>
-        </w:rPr>
-        <w:t xml:space="preserve">• </w:t>
-      </w:r>
-      <w:r>
-        <w:rPr>
-          <w:rFonts w:ascii="Arial" w:hAnsi="Arial" w:cs="Arial"/>
-          <w:sz w:val="22"/>
-          <w:szCs w:val="22"/>
-        </w:rPr>
-        <w:t xml:space="preserve">Outcomes are revealed immediately after lock-in </w:t>
-      </w:r>
-      <w:r>
-        <w:rPr>
-          <w:rFonts w:ascii="Arial" w:hAnsi="Arial" w:cs="Arial"/>
-          <w:sz w:val="22"/>
-          <w:szCs w:val="22"/>
-        </w:rPr>
-        <w:br/>
-      </w:r>
-      <w:r>
-        <w:rPr>
-          <w:rFonts w:ascii="Arial" w:hAnsi="Arial" w:cs="Arial"/>
-          <w:sz w:val="22"/>
-          <w:szCs w:val="22"/>
-        </w:rPr>
-        <w:t xml:space="preserve">• </w:t>
-      </w:r>
-      <w:r>
-        <w:rPr>
-          <w:rFonts w:ascii="Arial" w:hAnsi="Arial" w:cs="Arial"/>
-          <w:sz w:val="22"/>
-          <w:szCs w:val="22"/>
-        </w:rPr>
-        <w:t xml:space="preserve">One “Do Over” lifeline available (Questions 1–6 only) </w:t>
-      </w:r>
-    </w:p>
-    <w:p>
-      <w:pPr>
-        <w:rPr>
-          <w:rFonts w:ascii="Arial" w:hAnsi="Arial" w:cs="Arial"/>
+      </w:pPr>
+      <w:r>
+        <w:rPr>
+          <w:rFonts w:ascii="Helvetica Neue" w:hAnsi="Helvetica Neue" w:cs="Arial"/>
           <w:b/>
           <w:bCs/>
           <w:sz w:val="22"/>
           <w:szCs w:val="22"/>
         </w:rPr>
-      </w:pPr>
-      <w:r>
-        <w:rPr>
-          <w:rFonts w:ascii="Arial" w:hAnsi="Arial" w:cs="Arial"/>
+        <w:t>CORE PREMISE</w:t>
+      </w:r>
+    </w:p>
+    <w:p>
+      <w:pPr>
+        <w:rPr>
+          <w:rFonts w:ascii="Helvetica Neue" w:hAnsi="Helvetica Neue" w:cs="Arial"/>
+          <w:sz w:val="22"/>
+          <w:szCs w:val="22"/>
+        </w:rPr>
+      </w:pPr>
+      <w:r>
+        <w:rPr>
+          <w:rFonts w:ascii="Helvetica Neue" w:hAnsi="Helvetica Neue" w:cs="Arial"/>
           <w:b/>
           <w:bCs/>
           <w:sz w:val="22"/>
           <w:szCs w:val="22"/>
         </w:rPr>
+        <w:t>RISK vs. REWARD</w:t>
+      </w:r>
+      <w:r>
+        <w:rPr>
+          <w:rFonts w:ascii="Helvetica Neue" w:hAnsi="Helvetica Neue" w:cs="Arial"/>
+          <w:sz w:val="22"/>
+          <w:szCs w:val="22"/>
+        </w:rPr>
+        <w:t xml:space="preserve"> is a trivia game built around one idea:</w:t>
+      </w:r>
+    </w:p>
+    <w:p>
+      <w:pPr>
+        <w:ind w:left="720"/>
+        <w:rPr>
+          <w:rFonts w:ascii="Helvetica Neue" w:hAnsi="Helvetica Neue" w:cs="Arial"/>
+          <w:sz w:val="22"/>
+          <w:szCs w:val="22"/>
+        </w:rPr>
+      </w:pPr>
+      <w:r>
+        <w:rPr>
+          <w:rFonts w:ascii="Helvetica Neue" w:hAnsi="Helvetica Neue" w:cs="Arial"/>
+          <w:sz w:val="22"/>
+          <w:szCs w:val="22"/>
+        </w:rPr>
+        <w:t>Confidence is currency.</w:t>
+      </w:r>
+    </w:p>
+    <w:p>
+      <w:pPr>
+        <w:rPr>
+          <w:rFonts w:ascii="Helvetica Neue" w:hAnsi="Helvetica Neue" w:cs="Arial"/>
+          <w:sz w:val="22"/>
+          <w:szCs w:val="22"/>
+        </w:rPr>
+      </w:pPr>
+      <w:r>
+        <w:rPr>
+          <w:rFonts w:ascii="Helvetica Neue" w:hAnsi="Helvetica Neue" w:cs="Arial"/>
+          <w:sz w:val="22"/>
+          <w:szCs w:val="22"/>
+        </w:rPr>
+        <w:t>After seeing a question and its possible answers</w:t>
+      </w:r>
+      <w:r>
+        <w:rPr>
+          <w:rFonts w:ascii="Helvetica Neue" w:hAnsi="Helvetica Neue" w:cs="Arial"/>
+          <w:sz w:val="22"/>
+          <w:szCs w:val="22"/>
+        </w:rPr>
+        <w:t xml:space="preserve">, contestants </w:t>
+      </w:r>
+      <w:r>
+        <w:rPr>
+          <w:rFonts w:ascii="Helvetica Neue" w:hAnsi="Helvetica Neue" w:cs="Arial"/>
+          <w:sz w:val="22"/>
+          <w:szCs w:val="22"/>
+        </w:rPr>
+        <w:t xml:space="preserve">must </w:t>
+      </w:r>
+      <w:r>
+        <w:rPr>
+          <w:rFonts w:ascii="Helvetica Neue" w:hAnsi="Helvetica Neue" w:cs="Arial"/>
+          <w:sz w:val="22"/>
+          <w:szCs w:val="22"/>
+        </w:rPr>
+        <w:t xml:space="preserve">decide how much they believe in </w:t>
+      </w:r>
+      <w:r>
+        <w:rPr>
+          <w:rFonts w:ascii="Helvetica Neue" w:hAnsi="Helvetica Neue" w:cs="Arial"/>
+          <w:sz w:val="22"/>
+          <w:szCs w:val="22"/>
+        </w:rPr>
+        <w:t>their choice</w:t>
+      </w:r>
+      <w:r>
+        <w:rPr>
+          <w:rFonts w:ascii="Helvetica Neue" w:hAnsi="Helvetica Neue" w:cs="Arial"/>
+          <w:sz w:val="22"/>
+          <w:szCs w:val="22"/>
+        </w:rPr>
+        <w:t>. That decision is not just a wager—it reshapes their entire financial trajectory through the game.</w:t>
+      </w:r>
+    </w:p>
+    <w:p>
+      <w:pPr>
+        <w:rPr>
+          <w:rFonts w:ascii="Helvetica Neue" w:hAnsi="Helvetica Neue" w:cs="Arial"/>
+          <w:b/>
+          <w:bCs/>
+          <w:sz w:val="22"/>
+          <w:szCs w:val="22"/>
+        </w:rPr>
+      </w:pPr>
+      <w:r>
+        <w:rPr>
+          <w:rFonts w:ascii="Helvetica Neue" w:hAnsi="Helvetica Neue" w:cs="Arial"/>
+          <w:b/>
+          <w:bCs/>
+          <w:sz w:val="22"/>
+          <w:szCs w:val="22"/>
+        </w:rPr>
+        <w:t>GAME STRUCTURE</w:t>
+      </w:r>
+    </w:p>
+    <w:p>
+      <w:pPr>
+        <w:ind w:left="720"/>
+        <w:rPr>
+          <w:rFonts w:ascii="Helvetica Neue" w:hAnsi="Helvetica Neue" w:cs="Arial"/>
+          <w:sz w:val="22"/>
+          <w:szCs w:val="22"/>
+        </w:rPr>
+      </w:pPr>
+      <w:r>
+        <w:rPr>
+          <w:rFonts w:ascii="Helvetica Neue" w:hAnsi="Helvetica Neue" w:cs="Arial"/>
+          <w:sz w:val="22"/>
+          <w:szCs w:val="22"/>
+        </w:rPr>
+        <w:t xml:space="preserve">• </w:t>
+      </w:r>
+      <w:r>
+        <w:rPr>
+          <w:rFonts w:ascii="Helvetica Neue" w:hAnsi="Helvetica Neue" w:cs="Arial"/>
+          <w:sz w:val="22"/>
+          <w:szCs w:val="22"/>
+        </w:rPr>
+        <w:t xml:space="preserve">12-question single-contestant game (studio-based) </w:t>
+      </w:r>
+      <w:r>
+        <w:rPr>
+          <w:rFonts w:ascii="Helvetica Neue" w:hAnsi="Helvetica Neue" w:cs="Arial"/>
+          <w:sz w:val="22"/>
+          <w:szCs w:val="22"/>
+        </w:rPr>
+        <w:br/>
+      </w:r>
+      <w:r>
+        <w:rPr>
+          <w:rFonts w:ascii="Helvetica Neue" w:hAnsi="Helvetica Neue" w:cs="Arial"/>
+          <w:sz w:val="22"/>
+          <w:szCs w:val="22"/>
+        </w:rPr>
+        <w:t xml:space="preserve">• </w:t>
+      </w:r>
+      <w:r>
+        <w:rPr>
+          <w:rFonts w:ascii="Helvetica Neue" w:hAnsi="Helvetica Neue" w:cs="Arial"/>
+          <w:sz w:val="22"/>
+          <w:szCs w:val="22"/>
+        </w:rPr>
+        <w:t xml:space="preserve">Contestants choose a category before each question </w:t>
+      </w:r>
+      <w:r>
+        <w:rPr>
+          <w:rFonts w:ascii="Helvetica Neue" w:hAnsi="Helvetica Neue" w:cs="Arial"/>
+          <w:sz w:val="22"/>
+          <w:szCs w:val="22"/>
+        </w:rPr>
+        <w:br/>
+      </w:r>
+      <w:r>
+        <w:rPr>
+          <w:rFonts w:ascii="Helvetica Neue" w:hAnsi="Helvetica Neue" w:cs="Arial"/>
+          <w:sz w:val="22"/>
+          <w:szCs w:val="22"/>
+        </w:rPr>
+        <w:t xml:space="preserve">• </w:t>
+      </w:r>
+      <w:r>
+        <w:rPr>
+          <w:rFonts w:ascii="Helvetica Neue" w:hAnsi="Helvetica Neue" w:cs="Arial"/>
+          <w:sz w:val="22"/>
+          <w:szCs w:val="22"/>
+        </w:rPr>
+        <w:t xml:space="preserve">Each question is multiple choice (4 answers) </w:t>
+      </w:r>
+      <w:r>
+        <w:rPr>
+          <w:rFonts w:ascii="Helvetica Neue" w:hAnsi="Helvetica Neue" w:cs="Arial"/>
+          <w:sz w:val="22"/>
+          <w:szCs w:val="22"/>
+        </w:rPr>
+        <w:br/>
+      </w:r>
+      <w:r>
+        <w:rPr>
+          <w:rFonts w:ascii="Helvetica Neue" w:hAnsi="Helvetica Neue" w:cs="Arial"/>
+          <w:sz w:val="22"/>
+          <w:szCs w:val="22"/>
+        </w:rPr>
+        <w:t xml:space="preserve">• </w:t>
+      </w:r>
+      <w:r>
+        <w:rPr>
+          <w:rFonts w:ascii="Helvetica Neue" w:hAnsi="Helvetica Neue" w:cs="Arial"/>
+          <w:sz w:val="22"/>
+          <w:szCs w:val="22"/>
+        </w:rPr>
+        <w:t xml:space="preserve">Contestants answer first, then set confidence via slider </w:t>
+      </w:r>
+      <w:r>
+        <w:rPr>
+          <w:rFonts w:ascii="Helvetica Neue" w:hAnsi="Helvetica Neue" w:cs="Arial"/>
+          <w:sz w:val="22"/>
+          <w:szCs w:val="22"/>
+        </w:rPr>
+        <w:br/>
+      </w:r>
+      <w:r>
+        <w:rPr>
+          <w:rFonts w:ascii="Helvetica Neue" w:hAnsi="Helvetica Neue" w:cs="Arial"/>
+          <w:sz w:val="22"/>
+          <w:szCs w:val="22"/>
+        </w:rPr>
+        <w:t xml:space="preserve">• </w:t>
+      </w:r>
+      <w:r>
+        <w:rPr>
+          <w:rFonts w:ascii="Helvetica Neue" w:hAnsi="Helvetica Neue" w:cs="Arial"/>
+          <w:sz w:val="22"/>
+          <w:szCs w:val="22"/>
+        </w:rPr>
+        <w:t xml:space="preserve">Outcomes are revealed immediately after lock-in </w:t>
+      </w:r>
+      <w:r>
+        <w:rPr>
+          <w:rFonts w:ascii="Helvetica Neue" w:hAnsi="Helvetica Neue" w:cs="Arial"/>
+          <w:sz w:val="22"/>
+          <w:szCs w:val="22"/>
+        </w:rPr>
+        <w:br/>
+      </w:r>
+      <w:r>
+        <w:rPr>
+          <w:rFonts w:ascii="Helvetica Neue" w:hAnsi="Helvetica Neue" w:cs="Arial"/>
+          <w:sz w:val="22"/>
+          <w:szCs w:val="22"/>
+        </w:rPr>
+        <w:t xml:space="preserve">• </w:t>
+      </w:r>
+      <w:r>
+        <w:rPr>
+          <w:rFonts w:ascii="Helvetica Neue" w:hAnsi="Helvetica Neue" w:cs="Arial"/>
+          <w:sz w:val="22"/>
+          <w:szCs w:val="22"/>
+        </w:rPr>
+        <w:t xml:space="preserve">One “Do Over” lifeline available (Questions 1–6 only) </w:t>
+      </w:r>
+    </w:p>
+    <w:p>
+      <w:pPr>
+        <w:rPr>
+          <w:rFonts w:ascii="Helvetica Neue" w:hAnsi="Helvetica Neue" w:cs="Arial"/>
+          <w:b/>
+          <w:bCs/>
+          <w:sz w:val="22"/>
+          <w:szCs w:val="22"/>
+        </w:rPr>
+      </w:pPr>
+      <w:r>
+        <w:rPr>
+          <w:rFonts w:ascii="Helvetica Neue" w:hAnsi="Helvetica Neue" w:cs="Arial"/>
+          <w:b/>
+          <w:bCs/>
+          <w:sz w:val="22"/>
+          <w:szCs w:val="22"/>
+        </w:rPr>
         <w:t>CORE GAME LOOP (EVERY QUESTION)</w:t>
       </w:r>
     </w:p>
     <w:p>
       <w:pPr>
         <w:rPr>
-          <w:rFonts w:ascii="Arial" w:hAnsi="Arial" w:cs="Arial"/>
-          <w:sz w:val="22"/>
-          <w:szCs w:val="22"/>
-        </w:rPr>
-      </w:pPr>
-      <w:r>
-        <w:rPr>
-          <w:rFonts w:ascii="Arial" w:hAnsi="Arial" w:cs="Arial"/>
+          <w:rFonts w:ascii="Helvetica Neue" w:hAnsi="Helvetica Neue" w:cs="Arial"/>
+          <w:sz w:val="22"/>
+          <w:szCs w:val="22"/>
+        </w:rPr>
+      </w:pPr>
+      <w:r>
+        <w:rPr>
+          <w:rFonts w:ascii="Helvetica Neue" w:hAnsi="Helvetica Neue" w:cs="Arial"/>
           <w:sz w:val="22"/>
           <w:szCs w:val="22"/>
         </w:rPr>
@@ -510,14 +561,14 @@
         </w:tabs>
         <w:ind w:left="720"/>
         <w:rPr>
-          <w:rFonts w:ascii="Arial" w:hAnsi="Arial" w:cs="Arial"/>
-          <w:sz w:val="22"/>
-          <w:szCs w:val="22"/>
-        </w:rPr>
-      </w:pPr>
-      <w:r>
-        <w:rPr>
-          <w:rFonts w:ascii="Arial" w:hAnsi="Arial" w:cs="Arial"/>
+          <w:rFonts w:ascii="Helvetica Neue" w:hAnsi="Helvetica Neue" w:cs="Arial"/>
+          <w:sz w:val="22"/>
+          <w:szCs w:val="22"/>
+        </w:rPr>
+      </w:pPr>
+      <w:r>
+        <w:rPr>
+          <w:rFonts w:ascii="Helvetica Neue" w:hAnsi="Helvetica Neue" w:cs="Arial"/>
           <w:sz w:val="22"/>
           <w:szCs w:val="22"/>
         </w:rPr>
@@ -525,7 +576,7 @@
       </w:r>
       <w:r>
         <w:rPr>
-          <w:rFonts w:ascii="Arial" w:hAnsi="Arial" w:cs="Arial"/>
+          <w:rFonts w:ascii="Helvetica Neue" w:hAnsi="Helvetica Neue" w:cs="Arial"/>
           <w:sz w:val="22"/>
           <w:szCs w:val="22"/>
         </w:rPr>
@@ -533,7 +584,7 @@
       </w:r>
       <w:r>
         <w:rPr>
-          <w:rFonts w:ascii="Arial" w:hAnsi="Arial" w:cs="Arial"/>
+          <w:rFonts w:ascii="Helvetica Neue" w:hAnsi="Helvetica Neue" w:cs="Arial"/>
           <w:sz w:val="22"/>
           <w:szCs w:val="22"/>
         </w:rPr>
@@ -541,7 +592,7 @@
       </w:r>
       <w:r>
         <w:rPr>
-          <w:rFonts w:ascii="Arial" w:hAnsi="Arial" w:cs="Arial"/>
+          <w:rFonts w:ascii="Helvetica Neue" w:hAnsi="Helvetica Neue" w:cs="Arial"/>
           <w:sz w:val="22"/>
           <w:szCs w:val="22"/>
         </w:rPr>
@@ -550,7 +601,7 @@
       </w:r>
       <w:r>
         <w:rPr>
-          <w:rFonts w:ascii="Arial" w:hAnsi="Arial" w:cs="Arial"/>
+          <w:rFonts w:ascii="Helvetica Neue" w:hAnsi="Helvetica Neue" w:cs="Arial"/>
           <w:sz w:val="22"/>
           <w:szCs w:val="22"/>
         </w:rPr>
@@ -558,7 +609,7 @@
       </w:r>
       <w:r>
         <w:rPr>
-          <w:rFonts w:ascii="Arial" w:hAnsi="Arial" w:cs="Arial"/>
+          <w:rFonts w:ascii="Helvetica Neue" w:hAnsi="Helvetica Neue" w:cs="Arial"/>
           <w:sz w:val="22"/>
           <w:szCs w:val="22"/>
         </w:rPr>
@@ -566,7 +617,7 @@
       </w:r>
       <w:r>
         <w:rPr>
-          <w:rFonts w:ascii="Arial" w:hAnsi="Arial" w:cs="Arial"/>
+          <w:rFonts w:ascii="Helvetica Neue" w:hAnsi="Helvetica Neue" w:cs="Arial"/>
           <w:sz w:val="22"/>
           <w:szCs w:val="22"/>
         </w:rPr>
@@ -574,7 +625,7 @@
       </w:r>
       <w:r>
         <w:rPr>
-          <w:rFonts w:ascii="Arial" w:hAnsi="Arial" w:cs="Arial"/>
+          <w:rFonts w:ascii="Helvetica Neue" w:hAnsi="Helvetica Neue" w:cs="Arial"/>
           <w:sz w:val="22"/>
           <w:szCs w:val="22"/>
         </w:rPr>
@@ -583,7 +634,7 @@
       </w:r>
       <w:r>
         <w:rPr>
-          <w:rFonts w:ascii="Arial" w:hAnsi="Arial" w:cs="Arial"/>
+          <w:rFonts w:ascii="Helvetica Neue" w:hAnsi="Helvetica Neue" w:cs="Arial"/>
           <w:sz w:val="22"/>
           <w:szCs w:val="22"/>
         </w:rPr>
@@ -591,7 +642,7 @@
       </w:r>
       <w:r>
         <w:rPr>
-          <w:rFonts w:ascii="Arial" w:hAnsi="Arial" w:cs="Arial"/>
+          <w:rFonts w:ascii="Helvetica Neue" w:hAnsi="Helvetica Neue" w:cs="Arial"/>
           <w:sz w:val="22"/>
           <w:szCs w:val="22"/>
         </w:rPr>
@@ -599,7 +650,7 @@
       </w:r>
       <w:r>
         <w:rPr>
-          <w:rFonts w:ascii="Arial" w:hAnsi="Arial" w:cs="Arial"/>
+          <w:rFonts w:ascii="Helvetica Neue" w:hAnsi="Helvetica Neue" w:cs="Arial"/>
           <w:sz w:val="22"/>
           <w:szCs w:val="22"/>
         </w:rPr>
@@ -608,7 +659,7 @@
       </w:r>
       <w:r>
         <w:rPr>
-          <w:rFonts w:ascii="Arial" w:hAnsi="Arial" w:cs="Arial"/>
+          <w:rFonts w:ascii="Helvetica Neue" w:hAnsi="Helvetica Neue" w:cs="Arial"/>
           <w:sz w:val="22"/>
           <w:szCs w:val="22"/>
         </w:rPr>
@@ -616,7 +667,7 @@
       </w:r>
       <w:r>
         <w:rPr>
-          <w:rFonts w:ascii="Arial" w:hAnsi="Arial" w:cs="Arial"/>
+          <w:rFonts w:ascii="Helvetica Neue" w:hAnsi="Helvetica Neue" w:cs="Arial"/>
           <w:sz w:val="22"/>
           <w:szCs w:val="22"/>
         </w:rPr>
@@ -624,7 +675,7 @@
       </w:r>
       <w:r>
         <w:rPr>
-          <w:rFonts w:ascii="Arial" w:hAnsi="Arial" w:cs="Arial"/>
+          <w:rFonts w:ascii="Helvetica Neue" w:hAnsi="Helvetica Neue" w:cs="Arial"/>
           <w:sz w:val="22"/>
           <w:szCs w:val="22"/>
         </w:rPr>
@@ -633,7 +684,7 @@
       </w:r>
       <w:r>
         <w:rPr>
-          <w:rFonts w:ascii="Arial" w:hAnsi="Arial" w:cs="Arial"/>
+          <w:rFonts w:ascii="Helvetica Neue" w:hAnsi="Helvetica Neue" w:cs="Arial"/>
           <w:sz w:val="22"/>
           <w:szCs w:val="22"/>
         </w:rPr>
@@ -641,7 +692,7 @@
       </w:r>
       <w:r>
         <w:rPr>
-          <w:rFonts w:ascii="Arial" w:hAnsi="Arial" w:cs="Arial"/>
+          <w:rFonts w:ascii="Helvetica Neue" w:hAnsi="Helvetica Neue" w:cs="Arial"/>
           <w:sz w:val="22"/>
           <w:szCs w:val="22"/>
         </w:rPr>
@@ -649,7 +700,7 @@
       </w:r>
       <w:r>
         <w:rPr>
-          <w:rFonts w:ascii="Arial" w:hAnsi="Arial" w:cs="Arial"/>
+          <w:rFonts w:ascii="Helvetica Neue" w:hAnsi="Helvetica Neue" w:cs="Arial"/>
           <w:sz w:val="22"/>
           <w:szCs w:val="22"/>
         </w:rPr>
@@ -658,7 +709,7 @@
       </w:r>
       <w:r>
         <w:rPr>
-          <w:rFonts w:ascii="Arial" w:hAnsi="Arial" w:cs="Arial"/>
+          <w:rFonts w:ascii="Helvetica Neue" w:hAnsi="Helvetica Neue" w:cs="Arial"/>
           <w:sz w:val="22"/>
           <w:szCs w:val="22"/>
         </w:rPr>
@@ -666,7 +717,7 @@
       </w:r>
       <w:r>
         <w:rPr>
-          <w:rFonts w:ascii="Arial" w:hAnsi="Arial" w:cs="Arial"/>
+          <w:rFonts w:ascii="Helvetica Neue" w:hAnsi="Helvetica Neue" w:cs="Arial"/>
           <w:sz w:val="22"/>
           <w:szCs w:val="22"/>
         </w:rPr>
@@ -674,7 +725,7 @@
       </w:r>
       <w:r>
         <w:rPr>
-          <w:rFonts w:ascii="Arial" w:hAnsi="Arial" w:cs="Arial"/>
+          <w:rFonts w:ascii="Helvetica Neue" w:hAnsi="Helvetica Neue" w:cs="Arial"/>
           <w:sz w:val="22"/>
           <w:szCs w:val="22"/>
         </w:rPr>
@@ -683,7 +734,7 @@
       </w:r>
       <w:r>
         <w:rPr>
-          <w:rFonts w:ascii="Arial" w:hAnsi="Arial" w:cs="Arial"/>
+          <w:rFonts w:ascii="Helvetica Neue" w:hAnsi="Helvetica Neue" w:cs="Arial"/>
           <w:sz w:val="22"/>
           <w:szCs w:val="22"/>
         </w:rPr>
@@ -691,7 +742,7 @@
       </w:r>
       <w:r>
         <w:rPr>
-          <w:rFonts w:ascii="Arial" w:hAnsi="Arial" w:cs="Arial"/>
+          <w:rFonts w:ascii="Helvetica Neue" w:hAnsi="Helvetica Neue" w:cs="Arial"/>
           <w:sz w:val="22"/>
           <w:szCs w:val="22"/>
         </w:rPr>
@@ -701,7 +752,7 @@
     <w:p>
       <w:pPr>
         <w:rPr>
-          <w:rFonts w:ascii="Arial" w:hAnsi="Arial" w:cs="Arial"/>
+          <w:rFonts w:ascii="Helvetica Neue" w:hAnsi="Helvetica Neue" w:cs="Arial"/>
           <w:b/>
           <w:bCs/>
           <w:sz w:val="22"/>
@@ -710,7 +761,7 @@
       </w:pPr>
       <w:r>
         <w:rPr>
-          <w:rFonts w:ascii="Arial" w:hAnsi="Arial" w:cs="Arial"/>
+          <w:rFonts w:ascii="Helvetica Neue" w:hAnsi="Helvetica Neue" w:cs="Arial"/>
           <w:b/>
           <w:bCs/>
           <w:sz w:val="22"/>
@@ -722,14 +773,14 @@
     <w:p>
       <w:pPr>
         <w:rPr>
-          <w:rFonts w:ascii="Arial" w:hAnsi="Arial" w:cs="Arial"/>
-          <w:sz w:val="22"/>
-          <w:szCs w:val="22"/>
-        </w:rPr>
-      </w:pPr>
-      <w:r>
-        <w:rPr>
-          <w:rFonts w:ascii="Arial" w:hAnsi="Arial" w:cs="Arial"/>
+          <w:rFonts w:ascii="Helvetica Neue" w:hAnsi="Helvetica Neue" w:cs="Arial"/>
+          <w:sz w:val="22"/>
+          <w:szCs w:val="22"/>
+        </w:rPr>
+      </w:pPr>
+      <w:r>
+        <w:rPr>
+          <w:rFonts w:ascii="Helvetica Neue" w:hAnsi="Helvetica Neue" w:cs="Arial"/>
           <w:sz w:val="22"/>
           <w:szCs w:val="22"/>
         </w:rPr>
@@ -737,7 +788,7 @@
       </w:r>
       <w:r>
         <w:rPr>
-          <w:rFonts w:ascii="Arial" w:hAnsi="Arial" w:cs="Arial"/>
+          <w:rFonts w:ascii="Helvetica Neue" w:hAnsi="Helvetica Neue" w:cs="Arial"/>
           <w:sz w:val="22"/>
           <w:szCs w:val="22"/>
         </w:rPr>
@@ -747,14 +798,14 @@
     <w:p>
       <w:pPr>
         <w:rPr>
-          <w:rFonts w:ascii="Arial" w:hAnsi="Arial" w:cs="Arial"/>
-          <w:sz w:val="22"/>
-          <w:szCs w:val="22"/>
-        </w:rPr>
-      </w:pPr>
-      <w:r>
-        <w:rPr>
-          <w:rFonts w:ascii="Arial" w:hAnsi="Arial" w:cs="Arial"/>
+          <w:rFonts w:ascii="Helvetica Neue" w:hAnsi="Helvetica Neue" w:cs="Arial"/>
+          <w:sz w:val="22"/>
+          <w:szCs w:val="22"/>
+        </w:rPr>
+      </w:pPr>
+      <w:r>
+        <w:rPr>
+          <w:rFonts w:ascii="Helvetica Neue" w:hAnsi="Helvetica Neue" w:cs="Arial"/>
           <w:sz w:val="22"/>
           <w:szCs w:val="22"/>
         </w:rPr>
@@ -764,41 +815,41 @@
     <w:p>
       <w:pPr>
         <w:rPr>
-          <w:rFonts w:ascii="Arial" w:hAnsi="Arial" w:cs="Arial"/>
-          <w:sz w:val="22"/>
-          <w:szCs w:val="22"/>
-        </w:rPr>
-      </w:pPr>
-    </w:p>
-    <w:p>
-      <w:pPr>
-        <w:rPr>
-          <w:rFonts w:ascii="Arial" w:hAnsi="Arial" w:cs="Arial"/>
-          <w:sz w:val="22"/>
-          <w:szCs w:val="22"/>
-        </w:rPr>
-      </w:pPr>
-    </w:p>
-    <w:p>
-      <w:pPr>
-        <w:rPr>
-          <w:rFonts w:ascii="Arial" w:hAnsi="Arial" w:cs="Arial"/>
-          <w:sz w:val="22"/>
-          <w:szCs w:val="22"/>
-        </w:rPr>
-      </w:pPr>
-    </w:p>
-    <w:p>
-      <w:pPr>
-        <w:rPr>
-          <w:rFonts w:ascii="Arial" w:hAnsi="Arial" w:cs="Arial"/>
-          <w:sz w:val="22"/>
-          <w:szCs w:val="22"/>
-        </w:rPr>
-      </w:pPr>
-      <w:r>
-        <w:rPr>
-          <w:rFonts w:ascii="Arial" w:hAnsi="Arial" w:cs="Arial"/>
+          <w:rFonts w:ascii="Helvetica Neue" w:hAnsi="Helvetica Neue" w:cs="Arial"/>
+          <w:sz w:val="22"/>
+          <w:szCs w:val="22"/>
+        </w:rPr>
+      </w:pPr>
+    </w:p>
+    <w:p>
+      <w:pPr>
+        <w:rPr>
+          <w:rFonts w:ascii="Helvetica Neue" w:hAnsi="Helvetica Neue" w:cs="Arial"/>
+          <w:sz w:val="22"/>
+          <w:szCs w:val="22"/>
+        </w:rPr>
+      </w:pPr>
+    </w:p>
+    <w:p>
+      <w:pPr>
+        <w:rPr>
+          <w:rFonts w:ascii="Helvetica Neue" w:hAnsi="Helvetica Neue" w:cs="Arial"/>
+          <w:sz w:val="22"/>
+          <w:szCs w:val="22"/>
+        </w:rPr>
+      </w:pPr>
+    </w:p>
+    <w:p>
+      <w:pPr>
+        <w:rPr>
+          <w:rFonts w:ascii="Helvetica Neue" w:hAnsi="Helvetica Neue" w:cs="Arial"/>
+          <w:sz w:val="22"/>
+          <w:szCs w:val="22"/>
+        </w:rPr>
+      </w:pPr>
+      <w:r>
+        <w:rPr>
+          <w:rFonts w:ascii="Helvetica Neue" w:hAnsi="Helvetica Neue" w:cs="Arial"/>
           <w:sz w:val="22"/>
           <w:szCs w:val="22"/>
         </w:rPr>
@@ -809,14 +860,14 @@
       <w:pPr>
         <w:ind w:left="720"/>
         <w:rPr>
-          <w:rFonts w:ascii="Arial" w:hAnsi="Arial" w:cs="Arial"/>
-          <w:sz w:val="22"/>
-          <w:szCs w:val="22"/>
-        </w:rPr>
-      </w:pPr>
-      <w:r>
-        <w:rPr>
-          <w:rFonts w:ascii="Arial" w:hAnsi="Arial" w:cs="Arial"/>
+          <w:rFonts w:ascii="Helvetica Neue" w:hAnsi="Helvetica Neue" w:cs="Arial"/>
+          <w:sz w:val="22"/>
+          <w:szCs w:val="22"/>
+        </w:rPr>
+      </w:pPr>
+      <w:r>
+        <w:rPr>
+          <w:rFonts w:ascii="Helvetica Neue" w:hAnsi="Helvetica Neue" w:cs="Arial"/>
           <w:sz w:val="22"/>
           <w:szCs w:val="22"/>
         </w:rPr>
@@ -824,7 +875,7 @@
       </w:r>
       <w:r>
         <w:rPr>
-          <w:rFonts w:ascii="Arial" w:hAnsi="Arial" w:cs="Arial"/>
+          <w:rFonts w:ascii="Helvetica Neue" w:hAnsi="Helvetica Neue" w:cs="Arial"/>
           <w:sz w:val="22"/>
           <w:szCs w:val="22"/>
         </w:rPr>
@@ -832,7 +883,7 @@
       </w:r>
       <w:r>
         <w:rPr>
-          <w:rFonts w:ascii="Arial" w:hAnsi="Arial" w:cs="Arial"/>
+          <w:rFonts w:ascii="Helvetica Neue" w:hAnsi="Helvetica Neue" w:cs="Arial"/>
           <w:sz w:val="22"/>
           <w:szCs w:val="22"/>
         </w:rPr>
@@ -840,7 +891,7 @@
       </w:r>
       <w:r>
         <w:rPr>
-          <w:rFonts w:ascii="Arial" w:hAnsi="Arial" w:cs="Arial"/>
+          <w:rFonts w:ascii="Helvetica Neue" w:hAnsi="Helvetica Neue" w:cs="Arial"/>
           <w:sz w:val="22"/>
           <w:szCs w:val="22"/>
         </w:rPr>
@@ -848,7 +899,7 @@
       </w:r>
       <w:r>
         <w:rPr>
-          <w:rFonts w:ascii="Arial" w:hAnsi="Arial" w:cs="Arial"/>
+          <w:rFonts w:ascii="Helvetica Neue" w:hAnsi="Helvetica Neue" w:cs="Arial"/>
           <w:sz w:val="22"/>
           <w:szCs w:val="22"/>
         </w:rPr>
@@ -856,7 +907,7 @@
       </w:r>
       <w:r>
         <w:rPr>
-          <w:rFonts w:ascii="Arial" w:hAnsi="Arial" w:cs="Arial"/>
+          <w:rFonts w:ascii="Helvetica Neue" w:hAnsi="Helvetica Neue" w:cs="Arial"/>
           <w:sz w:val="22"/>
           <w:szCs w:val="22"/>
         </w:rPr>
@@ -864,7 +915,7 @@
       </w:r>
       <w:r>
         <w:rPr>
-          <w:rFonts w:ascii="Arial" w:hAnsi="Arial" w:cs="Arial"/>
+          <w:rFonts w:ascii="Helvetica Neue" w:hAnsi="Helvetica Neue" w:cs="Arial"/>
           <w:sz w:val="22"/>
           <w:szCs w:val="22"/>
         </w:rPr>
@@ -872,7 +923,7 @@
       </w:r>
       <w:r>
         <w:rPr>
-          <w:rFonts w:ascii="Arial" w:hAnsi="Arial" w:cs="Arial"/>
+          <w:rFonts w:ascii="Helvetica Neue" w:hAnsi="Helvetica Neue" w:cs="Arial"/>
           <w:sz w:val="22"/>
           <w:szCs w:val="22"/>
         </w:rPr>
@@ -882,14 +933,14 @@
     <w:p>
       <w:pPr>
         <w:rPr>
-          <w:rFonts w:ascii="Arial" w:hAnsi="Arial" w:cs="Arial"/>
-          <w:sz w:val="22"/>
-          <w:szCs w:val="22"/>
-        </w:rPr>
-      </w:pPr>
-      <w:r>
-        <w:rPr>
-          <w:rFonts w:ascii="Arial" w:hAnsi="Arial" w:cs="Arial"/>
+          <w:rFonts w:ascii="Helvetica Neue" w:hAnsi="Helvetica Neue" w:cs="Arial"/>
+          <w:sz w:val="22"/>
+          <w:szCs w:val="22"/>
+        </w:rPr>
+      </w:pPr>
+      <w:r>
+        <w:rPr>
+          <w:rFonts w:ascii="Helvetica Neue" w:hAnsi="Helvetica Neue" w:cs="Arial"/>
           <w:sz w:val="22"/>
           <w:szCs w:val="22"/>
         </w:rPr>
@@ -897,7 +948,7 @@
       </w:r>
       <w:r>
         <w:rPr>
-          <w:rFonts w:ascii="Arial" w:hAnsi="Arial" w:cs="Arial"/>
+          <w:rFonts w:ascii="Helvetica Neue" w:hAnsi="Helvetica Neue" w:cs="Arial"/>
           <w:b/>
           <w:bCs/>
           <w:sz w:val="22"/>
@@ -907,7 +958,7 @@
       </w:r>
       <w:r>
         <w:rPr>
-          <w:rFonts w:ascii="Arial" w:hAnsi="Arial" w:cs="Arial"/>
+          <w:rFonts w:ascii="Helvetica Neue" w:hAnsi="Helvetica Neue" w:cs="Arial"/>
           <w:sz w:val="22"/>
           <w:szCs w:val="22"/>
         </w:rPr>
@@ -917,7 +968,7 @@
     <w:p>
       <w:pPr>
         <w:rPr>
-          <w:rFonts w:ascii="Arial" w:hAnsi="Arial" w:cs="Arial"/>
+          <w:rFonts w:ascii="Helvetica Neue" w:hAnsi="Helvetica Neue" w:cs="Arial"/>
           <w:b/>
           <w:bCs/>
           <w:sz w:val="22"/>
@@ -926,7 +977,7 @@
       </w:pPr>
       <w:r>
         <w:rPr>
-          <w:rFonts w:ascii="Arial" w:hAnsi="Arial" w:cs="Arial"/>
+          <w:rFonts w:ascii="Helvetica Neue" w:hAnsi="Helvetica Neue" w:cs="Arial"/>
           <w:b/>
           <w:bCs/>
           <w:sz w:val="22"/>
@@ -938,14 +989,14 @@
     <w:p>
       <w:pPr>
         <w:rPr>
-          <w:rFonts w:ascii="Arial" w:hAnsi="Arial" w:cs="Arial"/>
-          <w:sz w:val="22"/>
-          <w:szCs w:val="22"/>
-        </w:rPr>
-      </w:pPr>
-      <w:r>
-        <w:rPr>
-          <w:rFonts w:ascii="Arial" w:hAnsi="Arial" w:cs="Arial"/>
+          <w:rFonts w:ascii="Helvetica Neue" w:hAnsi="Helvetica Neue" w:cs="Arial"/>
+          <w:sz w:val="22"/>
+          <w:szCs w:val="22"/>
+        </w:rPr>
+      </w:pPr>
+      <w:r>
+        <w:rPr>
+          <w:rFonts w:ascii="Helvetica Neue" w:hAnsi="Helvetica Neue" w:cs="Arial"/>
           <w:sz w:val="22"/>
           <w:szCs w:val="22"/>
         </w:rPr>
@@ -955,14 +1006,14 @@
     <w:p>
       <w:pPr>
         <w:rPr>
-          <w:rFonts w:ascii="Arial" w:hAnsi="Arial" w:cs="Arial"/>
-          <w:sz w:val="22"/>
-          <w:szCs w:val="22"/>
-        </w:rPr>
-      </w:pPr>
-      <w:r>
-        <w:rPr>
-          <w:rFonts w:ascii="Arial" w:hAnsi="Arial" w:cs="Arial"/>
+          <w:rFonts w:ascii="Helvetica Neue" w:hAnsi="Helvetica Neue" w:cs="Arial"/>
+          <w:sz w:val="22"/>
+          <w:szCs w:val="22"/>
+        </w:rPr>
+      </w:pPr>
+      <w:r>
+        <w:rPr>
+          <w:rFonts w:ascii="Helvetica Neue" w:hAnsi="Helvetica Neue" w:cs="Arial"/>
           <w:sz w:val="22"/>
           <w:szCs w:val="22"/>
         </w:rPr>
@@ -973,14 +1024,14 @@
       <w:pPr>
         <w:ind w:left="720"/>
         <w:rPr>
-          <w:rFonts w:ascii="Arial" w:hAnsi="Arial" w:cs="Arial"/>
-          <w:sz w:val="22"/>
-          <w:szCs w:val="22"/>
-        </w:rPr>
-      </w:pPr>
-      <w:r>
-        <w:rPr>
-          <w:rFonts w:ascii="Arial" w:hAnsi="Arial" w:cs="Arial"/>
+          <w:rFonts w:ascii="Helvetica Neue" w:hAnsi="Helvetica Neue" w:cs="Arial"/>
+          <w:sz w:val="22"/>
+          <w:szCs w:val="22"/>
+        </w:rPr>
+      </w:pPr>
+      <w:r>
+        <w:rPr>
+          <w:rFonts w:ascii="Helvetica Neue" w:hAnsi="Helvetica Neue" w:cs="Arial"/>
           <w:sz w:val="22"/>
           <w:szCs w:val="22"/>
         </w:rPr>
@@ -988,7 +1039,7 @@
       </w:r>
       <w:r>
         <w:rPr>
-          <w:rFonts w:ascii="Arial" w:hAnsi="Arial" w:cs="Arial"/>
+          <w:rFonts w:ascii="Helvetica Neue" w:hAnsi="Helvetica Neue" w:cs="Arial"/>
           <w:sz w:val="22"/>
           <w:szCs w:val="22"/>
         </w:rPr>
@@ -996,7 +1047,7 @@
       </w:r>
       <w:r>
         <w:rPr>
-          <w:rFonts w:ascii="Arial" w:hAnsi="Arial" w:cs="Arial"/>
+          <w:rFonts w:ascii="Helvetica Neue" w:hAnsi="Helvetica Neue" w:cs="Arial"/>
           <w:sz w:val="22"/>
           <w:szCs w:val="22"/>
         </w:rPr>
@@ -1004,7 +1055,7 @@
       </w:r>
       <w:r>
         <w:rPr>
-          <w:rFonts w:ascii="Arial" w:hAnsi="Arial" w:cs="Arial"/>
+          <w:rFonts w:ascii="Helvetica Neue" w:hAnsi="Helvetica Neue" w:cs="Arial"/>
           <w:sz w:val="22"/>
           <w:szCs w:val="22"/>
         </w:rPr>
@@ -1012,7 +1063,7 @@
       </w:r>
       <w:r>
         <w:rPr>
-          <w:rFonts w:ascii="Arial" w:hAnsi="Arial" w:cs="Arial"/>
+          <w:rFonts w:ascii="Helvetica Neue" w:hAnsi="Helvetica Neue" w:cs="Arial"/>
           <w:sz w:val="22"/>
           <w:szCs w:val="22"/>
         </w:rPr>
@@ -1020,7 +1071,7 @@
       </w:r>
       <w:r>
         <w:rPr>
-          <w:rFonts w:ascii="Arial" w:hAnsi="Arial" w:cs="Arial"/>
+          <w:rFonts w:ascii="Helvetica Neue" w:hAnsi="Helvetica Neue" w:cs="Arial"/>
           <w:sz w:val="22"/>
           <w:szCs w:val="22"/>
         </w:rPr>
@@ -1028,7 +1079,7 @@
       </w:r>
       <w:r>
         <w:rPr>
-          <w:rFonts w:ascii="Arial" w:hAnsi="Arial" w:cs="Arial"/>
+          <w:rFonts w:ascii="Helvetica Neue" w:hAnsi="Helvetica Neue" w:cs="Arial"/>
           <w:sz w:val="22"/>
           <w:szCs w:val="22"/>
         </w:rPr>
@@ -1036,7 +1087,7 @@
       </w:r>
       <w:r>
         <w:rPr>
-          <w:rFonts w:ascii="Arial" w:hAnsi="Arial" w:cs="Arial"/>
+          <w:rFonts w:ascii="Helvetica Neue" w:hAnsi="Helvetica Neue" w:cs="Arial"/>
           <w:sz w:val="22"/>
           <w:szCs w:val="22"/>
         </w:rPr>
@@ -1044,7 +1095,7 @@
       </w:r>
       <w:r>
         <w:rPr>
-          <w:rFonts w:ascii="Arial" w:hAnsi="Arial" w:cs="Arial"/>
+          <w:rFonts w:ascii="Helvetica Neue" w:hAnsi="Helvetica Neue" w:cs="Arial"/>
           <w:sz w:val="22"/>
           <w:szCs w:val="22"/>
         </w:rPr>
@@ -1052,7 +1103,7 @@
       </w:r>
       <w:r>
         <w:rPr>
-          <w:rFonts w:ascii="Arial" w:hAnsi="Arial" w:cs="Arial"/>
+          <w:rFonts w:ascii="Helvetica Neue" w:hAnsi="Helvetica Neue" w:cs="Arial"/>
           <w:sz w:val="22"/>
           <w:szCs w:val="22"/>
         </w:rPr>
@@ -1060,7 +1111,7 @@
       </w:r>
       <w:r>
         <w:rPr>
-          <w:rFonts w:ascii="Arial" w:hAnsi="Arial" w:cs="Arial"/>
+          <w:rFonts w:ascii="Helvetica Neue" w:hAnsi="Helvetica Neue" w:cs="Arial"/>
           <w:sz w:val="22"/>
           <w:szCs w:val="22"/>
         </w:rPr>
@@ -1070,14 +1121,14 @@
     <w:p>
       <w:pPr>
         <w:rPr>
-          <w:rFonts w:ascii="Arial" w:hAnsi="Arial" w:cs="Arial"/>
-          <w:sz w:val="22"/>
-          <w:szCs w:val="22"/>
-        </w:rPr>
-      </w:pPr>
-      <w:r>
-        <w:rPr>
-          <w:rFonts w:ascii="Arial" w:hAnsi="Arial" w:cs="Arial"/>
+          <w:rFonts w:ascii="Helvetica Neue" w:hAnsi="Helvetica Neue" w:cs="Arial"/>
+          <w:sz w:val="22"/>
+          <w:szCs w:val="22"/>
+        </w:rPr>
+      </w:pPr>
+      <w:r>
+        <w:rPr>
+          <w:rFonts w:ascii="Helvetica Neue" w:hAnsi="Helvetica Neue" w:cs="Arial"/>
           <w:sz w:val="22"/>
           <w:szCs w:val="22"/>
         </w:rPr>
@@ -1085,7 +1136,7 @@
       </w:r>
       <w:r>
         <w:rPr>
-          <w:rFonts w:ascii="Arial" w:hAnsi="Arial" w:cs="Arial"/>
+          <w:rFonts w:ascii="Helvetica Neue" w:hAnsi="Helvetica Neue" w:cs="Arial"/>
           <w:sz w:val="22"/>
           <w:szCs w:val="22"/>
         </w:rPr>
@@ -1093,7 +1144,7 @@
       </w:r>
       <w:r>
         <w:rPr>
-          <w:rFonts w:ascii="Arial" w:hAnsi="Arial" w:cs="Arial"/>
+          <w:rFonts w:ascii="Helvetica Neue" w:hAnsi="Helvetica Neue" w:cs="Arial"/>
           <w:sz w:val="22"/>
           <w:szCs w:val="22"/>
         </w:rPr>
@@ -1103,14 +1154,14 @@
     <w:p>
       <w:pPr>
         <w:rPr>
-          <w:rFonts w:ascii="Arial" w:hAnsi="Arial" w:cs="Arial"/>
-          <w:sz w:val="22"/>
-          <w:szCs w:val="22"/>
-        </w:rPr>
-      </w:pPr>
-      <w:r>
-        <w:rPr>
-          <w:rFonts w:ascii="Arial" w:hAnsi="Arial" w:cs="Arial"/>
+          <w:rFonts w:ascii="Helvetica Neue" w:hAnsi="Helvetica Neue" w:cs="Arial"/>
+          <w:sz w:val="22"/>
+          <w:szCs w:val="22"/>
+        </w:rPr>
+      </w:pPr>
+      <w:r>
+        <w:rPr>
+          <w:rFonts w:ascii="Helvetica Neue" w:hAnsi="Helvetica Neue" w:cs="Arial"/>
           <w:sz w:val="22"/>
           <w:szCs w:val="22"/>
         </w:rPr>
@@ -1121,14 +1172,14 @@
       <w:pPr>
         <w:ind w:left="720"/>
         <w:rPr>
-          <w:rFonts w:ascii="Arial" w:hAnsi="Arial" w:cs="Arial"/>
-          <w:sz w:val="22"/>
-          <w:szCs w:val="22"/>
-        </w:rPr>
-      </w:pPr>
-      <w:r>
-        <w:rPr>
-          <w:rFonts w:ascii="Arial" w:hAnsi="Arial" w:cs="Arial"/>
+          <w:rFonts w:ascii="Helvetica Neue" w:hAnsi="Helvetica Neue" w:cs="Arial"/>
+          <w:sz w:val="22"/>
+          <w:szCs w:val="22"/>
+        </w:rPr>
+      </w:pPr>
+      <w:r>
+        <w:rPr>
+          <w:rFonts w:ascii="Helvetica Neue" w:hAnsi="Helvetica Neue" w:cs="Arial"/>
           <w:sz w:val="22"/>
           <w:szCs w:val="22"/>
         </w:rPr>
@@ -1138,7 +1189,7 @@
     <w:p>
       <w:pPr>
         <w:rPr>
-          <w:rFonts w:ascii="Arial" w:hAnsi="Arial" w:cs="Arial"/>
+          <w:rFonts w:ascii="Helvetica Neue" w:hAnsi="Helvetica Neue" w:cs="Arial"/>
           <w:b/>
           <w:bCs/>
           <w:sz w:val="22"/>
@@ -1147,7 +1198,7 @@
       </w:pPr>
       <w:r>
         <w:rPr>
-          <w:rFonts w:ascii="Arial" w:hAnsi="Arial" w:cs="Arial"/>
+          <w:rFonts w:ascii="Helvetica Neue" w:hAnsi="Helvetica Neue" w:cs="Arial"/>
           <w:b/>
           <w:bCs/>
           <w:sz w:val="22"/>
@@ -1159,14 +1210,14 @@
     <w:p>
       <w:pPr>
         <w:rPr>
-          <w:rFonts w:ascii="Arial" w:hAnsi="Arial" w:cs="Arial"/>
-          <w:sz w:val="22"/>
-          <w:szCs w:val="22"/>
-        </w:rPr>
-      </w:pPr>
-      <w:r>
-        <w:rPr>
-          <w:rFonts w:ascii="Arial" w:hAnsi="Arial" w:cs="Arial"/>
+          <w:rFonts w:ascii="Helvetica Neue" w:hAnsi="Helvetica Neue" w:cs="Arial"/>
+          <w:sz w:val="22"/>
+          <w:szCs w:val="22"/>
+        </w:rPr>
+      </w:pPr>
+      <w:r>
+        <w:rPr>
+          <w:rFonts w:ascii="Helvetica Neue" w:hAnsi="Helvetica Neue" w:cs="Arial"/>
           <w:sz w:val="22"/>
           <w:szCs w:val="22"/>
         </w:rPr>
@@ -1176,7 +1227,7 @@
     <w:p>
       <w:pPr>
         <w:rPr>
-          <w:rFonts w:ascii="Arial" w:hAnsi="Arial" w:cs="Arial"/>
+          <w:rFonts w:ascii="Helvetica Neue" w:hAnsi="Helvetica Neue" w:cs="Arial"/>
           <w:b/>
           <w:bCs/>
           <w:sz w:val="22"/>
@@ -1185,7 +1236,7 @@
       </w:pPr>
       <w:r>
         <w:rPr>
-          <w:rFonts w:ascii="Arial" w:hAnsi="Arial" w:cs="Arial"/>
+          <w:rFonts w:ascii="Helvetica Neue" w:hAnsi="Helvetica Neue" w:cs="Arial"/>
           <w:b/>
           <w:bCs/>
           <w:sz w:val="22"/>
@@ -1198,14 +1249,14 @@
       <w:pPr>
         <w:ind w:left="720"/>
         <w:rPr>
-          <w:rFonts w:ascii="Arial" w:hAnsi="Arial" w:cs="Arial"/>
-          <w:sz w:val="22"/>
-          <w:szCs w:val="22"/>
-        </w:rPr>
-      </w:pPr>
-      <w:r>
-        <w:rPr>
-          <w:rFonts w:ascii="Arial" w:hAnsi="Arial" w:cs="Arial"/>
+          <w:rFonts w:ascii="Helvetica Neue" w:hAnsi="Helvetica Neue" w:cs="Arial"/>
+          <w:sz w:val="22"/>
+          <w:szCs w:val="22"/>
+        </w:rPr>
+      </w:pPr>
+      <w:r>
+        <w:rPr>
+          <w:rFonts w:ascii="Helvetica Neue" w:hAnsi="Helvetica Neue" w:cs="Arial"/>
           <w:sz w:val="22"/>
           <w:szCs w:val="22"/>
         </w:rPr>
@@ -1213,7 +1264,7 @@
       </w:r>
       <w:r>
         <w:rPr>
-          <w:rFonts w:ascii="Arial" w:hAnsi="Arial" w:cs="Arial"/>
+          <w:rFonts w:ascii="Helvetica Neue" w:hAnsi="Helvetica Neue" w:cs="Arial"/>
           <w:sz w:val="22"/>
           <w:szCs w:val="22"/>
         </w:rPr>
@@ -1221,7 +1272,7 @@
       </w:r>
       <w:r>
         <w:rPr>
-          <w:rFonts w:ascii="Arial" w:hAnsi="Arial" w:cs="Arial"/>
+          <w:rFonts w:ascii="Helvetica Neue" w:hAnsi="Helvetica Neue" w:cs="Arial"/>
           <w:sz w:val="22"/>
           <w:szCs w:val="22"/>
         </w:rPr>
@@ -1229,7 +1280,7 @@
       </w:r>
       <w:r>
         <w:rPr>
-          <w:rFonts w:ascii="Arial" w:hAnsi="Arial" w:cs="Arial"/>
+          <w:rFonts w:ascii="Helvetica Neue" w:hAnsi="Helvetica Neue" w:cs="Arial"/>
           <w:sz w:val="22"/>
           <w:szCs w:val="22"/>
         </w:rPr>
@@ -1237,7 +1288,7 @@
       </w:r>
       <w:r>
         <w:rPr>
-          <w:rFonts w:ascii="Arial" w:hAnsi="Arial" w:cs="Arial"/>
+          <w:rFonts w:ascii="Helvetica Neue" w:hAnsi="Helvetica Neue" w:cs="Arial"/>
           <w:sz w:val="22"/>
           <w:szCs w:val="22"/>
         </w:rPr>
@@ -1245,7 +1296,7 @@
       </w:r>
       <w:r>
         <w:rPr>
-          <w:rFonts w:ascii="Arial" w:hAnsi="Arial" w:cs="Arial"/>
+          <w:rFonts w:ascii="Helvetica Neue" w:hAnsi="Helvetica Neue" w:cs="Arial"/>
           <w:sz w:val="22"/>
           <w:szCs w:val="22"/>
         </w:rPr>
@@ -1253,7 +1304,7 @@
       </w:r>
       <w:r>
         <w:rPr>
-          <w:rFonts w:ascii="Arial" w:hAnsi="Arial" w:cs="Arial"/>
+          <w:rFonts w:ascii="Helvetica Neue" w:hAnsi="Helvetica Neue" w:cs="Arial"/>
           <w:sz w:val="22"/>
           <w:szCs w:val="22"/>
         </w:rPr>
@@ -1261,7 +1312,7 @@
       </w:r>
       <w:r>
         <w:rPr>
-          <w:rFonts w:ascii="Arial" w:hAnsi="Arial" w:cs="Arial"/>
+          <w:rFonts w:ascii="Helvetica Neue" w:hAnsi="Helvetica Neue" w:cs="Arial"/>
           <w:sz w:val="22"/>
           <w:szCs w:val="22"/>
         </w:rPr>
@@ -1271,7 +1322,7 @@
     <w:p>
       <w:pPr>
         <w:rPr>
-          <w:rFonts w:ascii="Arial" w:hAnsi="Arial" w:cs="Arial"/>
+          <w:rFonts w:ascii="Helvetica Neue" w:hAnsi="Helvetica Neue" w:cs="Arial"/>
           <w:b/>
           <w:bCs/>
           <w:sz w:val="22"/>
@@ -1280,7 +1331,7 @@
       </w:pPr>
       <w:r>
         <w:rPr>
-          <w:rFonts w:ascii="Arial" w:hAnsi="Arial" w:cs="Arial"/>
+          <w:rFonts w:ascii="Helvetica Neue" w:hAnsi="Helvetica Neue" w:cs="Arial"/>
           <w:b/>
           <w:bCs/>
           <w:sz w:val="22"/>
@@ -1293,14 +1344,14 @@
       <w:pPr>
         <w:ind w:left="720"/>
         <w:rPr>
-          <w:rFonts w:ascii="Arial" w:hAnsi="Arial" w:cs="Arial"/>
-          <w:sz w:val="22"/>
-          <w:szCs w:val="22"/>
-        </w:rPr>
-      </w:pPr>
-      <w:r>
-        <w:rPr>
-          <w:rFonts w:ascii="Arial" w:hAnsi="Arial" w:cs="Arial"/>
+          <w:rFonts w:ascii="Helvetica Neue" w:hAnsi="Helvetica Neue" w:cs="Arial"/>
+          <w:sz w:val="22"/>
+          <w:szCs w:val="22"/>
+        </w:rPr>
+      </w:pPr>
+      <w:r>
+        <w:rPr>
+          <w:rFonts w:ascii="Helvetica Neue" w:hAnsi="Helvetica Neue" w:cs="Arial"/>
           <w:sz w:val="22"/>
           <w:szCs w:val="22"/>
         </w:rPr>
@@ -1308,7 +1359,7 @@
       </w:r>
       <w:r>
         <w:rPr>
-          <w:rFonts w:ascii="Arial" w:hAnsi="Arial" w:cs="Arial"/>
+          <w:rFonts w:ascii="Helvetica Neue" w:hAnsi="Helvetica Neue" w:cs="Arial"/>
           <w:sz w:val="22"/>
           <w:szCs w:val="22"/>
         </w:rPr>
@@ -1316,7 +1367,7 @@
       </w:r>
       <w:r>
         <w:rPr>
-          <w:rFonts w:ascii="Arial" w:hAnsi="Arial" w:cs="Arial"/>
+          <w:rFonts w:ascii="Helvetica Neue" w:hAnsi="Helvetica Neue" w:cs="Arial"/>
           <w:sz w:val="22"/>
           <w:szCs w:val="22"/>
         </w:rPr>
@@ -1324,7 +1375,7 @@
       </w:r>
       <w:r>
         <w:rPr>
-          <w:rFonts w:ascii="Arial" w:hAnsi="Arial" w:cs="Arial"/>
+          <w:rFonts w:ascii="Helvetica Neue" w:hAnsi="Helvetica Neue" w:cs="Arial"/>
           <w:sz w:val="22"/>
           <w:szCs w:val="22"/>
         </w:rPr>
@@ -1332,7 +1383,7 @@
       </w:r>
       <w:r>
         <w:rPr>
-          <w:rFonts w:ascii="Arial" w:hAnsi="Arial" w:cs="Arial"/>
+          <w:rFonts w:ascii="Helvetica Neue" w:hAnsi="Helvetica Neue" w:cs="Arial"/>
           <w:sz w:val="22"/>
           <w:szCs w:val="22"/>
         </w:rPr>
@@ -1340,7 +1391,7 @@
       </w:r>
       <w:r>
         <w:rPr>
-          <w:rFonts w:ascii="Arial" w:hAnsi="Arial" w:cs="Arial"/>
+          <w:rFonts w:ascii="Helvetica Neue" w:hAnsi="Helvetica Neue" w:cs="Arial"/>
           <w:sz w:val="22"/>
           <w:szCs w:val="22"/>
         </w:rPr>
@@ -1348,7 +1399,7 @@
       </w:r>
       <w:r>
         <w:rPr>
-          <w:rFonts w:ascii="Arial" w:hAnsi="Arial" w:cs="Arial"/>
+          <w:rFonts w:ascii="Helvetica Neue" w:hAnsi="Helvetica Neue" w:cs="Arial"/>
           <w:sz w:val="22"/>
           <w:szCs w:val="22"/>
         </w:rPr>
@@ -1356,7 +1407,7 @@
       </w:r>
       <w:r>
         <w:rPr>
-          <w:rFonts w:ascii="Arial" w:hAnsi="Arial" w:cs="Arial"/>
+          <w:rFonts w:ascii="Helvetica Neue" w:hAnsi="Helvetica Neue" w:cs="Arial"/>
           <w:sz w:val="22"/>
           <w:szCs w:val="22"/>
         </w:rPr>
@@ -1366,7 +1417,7 @@
     <w:p>
       <w:pPr>
         <w:rPr>
-          <w:rFonts w:ascii="Arial" w:hAnsi="Arial" w:cs="Arial"/>
+          <w:rFonts w:ascii="Helvetica Neue" w:hAnsi="Helvetica Neue" w:cs="Arial"/>
           <w:b/>
           <w:bCs/>
           <w:sz w:val="22"/>
@@ -1375,7 +1426,7 @@
       </w:pPr>
       <w:r>
         <w:rPr>
-          <w:rFonts w:ascii="Arial" w:hAnsi="Arial" w:cs="Arial"/>
+          <w:rFonts w:ascii="Helvetica Neue" w:hAnsi="Helvetica Neue" w:cs="Arial"/>
           <w:b/>
           <w:bCs/>
           <w:sz w:val="22"/>
@@ -1387,14 +1438,14 @@
     <w:p>
       <w:pPr>
         <w:rPr>
-          <w:rFonts w:ascii="Arial" w:hAnsi="Arial" w:cs="Arial"/>
-          <w:sz w:val="22"/>
-          <w:szCs w:val="22"/>
-        </w:rPr>
-      </w:pPr>
-      <w:r>
-        <w:rPr>
-          <w:rFonts w:ascii="Arial" w:hAnsi="Arial" w:cs="Arial"/>
+          <w:rFonts w:ascii="Helvetica Neue" w:hAnsi="Helvetica Neue" w:cs="Arial"/>
+          <w:sz w:val="22"/>
+          <w:szCs w:val="22"/>
+        </w:rPr>
+      </w:pPr>
+      <w:r>
+        <w:rPr>
+          <w:rFonts w:ascii="Helvetica Neue" w:hAnsi="Helvetica Neue" w:cs="Arial"/>
           <w:sz w:val="22"/>
           <w:szCs w:val="22"/>
         </w:rPr>
@@ -1404,14 +1455,14 @@
     <w:p>
       <w:pPr>
         <w:rPr>
-          <w:rFonts w:ascii="Arial" w:hAnsi="Arial" w:cs="Arial"/>
-          <w:sz w:val="22"/>
-          <w:szCs w:val="22"/>
-        </w:rPr>
-      </w:pPr>
-      <w:r>
-        <w:rPr>
-          <w:rFonts w:ascii="Arial" w:hAnsi="Arial" w:cs="Arial"/>
+          <w:rFonts w:ascii="Helvetica Neue" w:hAnsi="Helvetica Neue" w:cs="Arial"/>
+          <w:sz w:val="22"/>
+          <w:szCs w:val="22"/>
+        </w:rPr>
+      </w:pPr>
+      <w:r>
+        <w:rPr>
+          <w:rFonts w:ascii="Helvetica Neue" w:hAnsi="Helvetica Neue" w:cs="Arial"/>
           <w:sz w:val="22"/>
           <w:szCs w:val="22"/>
         </w:rPr>
@@ -1419,7 +1470,7 @@
       </w:r>
       <w:r>
         <w:rPr>
-          <w:rFonts w:ascii="Arial" w:hAnsi="Arial" w:cs="Arial"/>
+          <w:rFonts w:ascii="Helvetica Neue" w:hAnsi="Helvetica Neue" w:cs="Arial"/>
           <w:sz w:val="22"/>
           <w:szCs w:val="22"/>
         </w:rPr>
@@ -1429,7 +1480,7 @@
     <w:p>
       <w:pPr>
         <w:rPr>
-          <w:rFonts w:ascii="Arial" w:hAnsi="Arial" w:cs="Arial"/>
+          <w:rFonts w:ascii="Helvetica Neue" w:hAnsi="Helvetica Neue" w:cs="Arial"/>
           <w:b/>
           <w:bCs/>
           <w:sz w:val="22"/>
@@ -1438,7 +1489,7 @@
       </w:pPr>
       <w:r>
         <w:rPr>
-          <w:rFonts w:ascii="Arial" w:hAnsi="Arial" w:cs="Arial"/>
+          <w:rFonts w:ascii="Helvetica Neue" w:hAnsi="Helvetica Neue" w:cs="Arial"/>
           <w:b/>
           <w:bCs/>
           <w:sz w:val="22"/>
@@ -1450,14 +1501,14 @@
     <w:p>
       <w:pPr>
         <w:rPr>
-          <w:rFonts w:ascii="Arial" w:hAnsi="Arial" w:cs="Arial"/>
-          <w:sz w:val="22"/>
-          <w:szCs w:val="22"/>
-        </w:rPr>
-      </w:pPr>
-      <w:r>
-        <w:rPr>
-          <w:rFonts w:ascii="Arial" w:hAnsi="Arial" w:cs="Arial"/>
+          <w:rFonts w:ascii="Helvetica Neue" w:hAnsi="Helvetica Neue" w:cs="Arial"/>
+          <w:sz w:val="22"/>
+          <w:szCs w:val="22"/>
+        </w:rPr>
+      </w:pPr>
+      <w:r>
+        <w:rPr>
+          <w:rFonts w:ascii="Helvetica Neue" w:hAnsi="Helvetica Neue" w:cs="Arial"/>
           <w:sz w:val="22"/>
           <w:szCs w:val="22"/>
         </w:rPr>
@@ -1468,14 +1519,14 @@
       <w:pPr>
         <w:ind w:left="720"/>
         <w:rPr>
-          <w:rFonts w:ascii="Arial" w:hAnsi="Arial" w:cs="Arial"/>
-          <w:sz w:val="22"/>
-          <w:szCs w:val="22"/>
-        </w:rPr>
-      </w:pPr>
-      <w:r>
-        <w:rPr>
-          <w:rFonts w:ascii="Arial" w:hAnsi="Arial" w:cs="Arial"/>
+          <w:rFonts w:ascii="Helvetica Neue" w:hAnsi="Helvetica Neue" w:cs="Arial"/>
+          <w:sz w:val="22"/>
+          <w:szCs w:val="22"/>
+        </w:rPr>
+      </w:pPr>
+      <w:r>
+        <w:rPr>
+          <w:rFonts w:ascii="Helvetica Neue" w:hAnsi="Helvetica Neue" w:cs="Arial"/>
           <w:sz w:val="22"/>
           <w:szCs w:val="22"/>
         </w:rPr>
@@ -1484,7 +1535,7 @@
       </w:r>
       <w:r>
         <w:rPr>
-          <w:rFonts w:ascii="Arial" w:hAnsi="Arial" w:cs="Arial"/>
+          <w:rFonts w:ascii="Helvetica Neue" w:hAnsi="Helvetica Neue" w:cs="Arial"/>
           <w:b/>
           <w:bCs/>
           <w:sz w:val="22"/>
@@ -1494,7 +1545,7 @@
       </w:r>
       <w:r>
         <w:rPr>
-          <w:rFonts w:ascii="Arial" w:hAnsi="Arial" w:cs="Arial"/>
+          <w:rFonts w:ascii="Helvetica Neue" w:hAnsi="Helvetica Neue" w:cs="Arial"/>
           <w:sz w:val="22"/>
           <w:szCs w:val="22"/>
         </w:rPr>
@@ -1502,7 +1553,7 @@
       </w:r>
       <w:r>
         <w:rPr>
-          <w:rFonts w:ascii="Arial" w:hAnsi="Arial" w:cs="Arial"/>
+          <w:rFonts w:ascii="Helvetica Neue" w:hAnsi="Helvetica Neue" w:cs="Arial"/>
           <w:sz w:val="22"/>
           <w:szCs w:val="22"/>
         </w:rPr>
@@ -1510,7 +1561,7 @@
       </w:r>
       <w:r>
         <w:rPr>
-          <w:rFonts w:ascii="Arial" w:hAnsi="Arial" w:cs="Arial"/>
+          <w:rFonts w:ascii="Helvetica Neue" w:hAnsi="Helvetica Neue" w:cs="Arial"/>
           <w:sz w:val="22"/>
           <w:szCs w:val="22"/>
         </w:rPr>
@@ -1518,7 +1569,7 @@
       </w:r>
       <w:r>
         <w:rPr>
-          <w:rFonts w:ascii="Arial" w:hAnsi="Arial" w:cs="Arial"/>
+          <w:rFonts w:ascii="Helvetica Neue" w:hAnsi="Helvetica Neue" w:cs="Arial"/>
           <w:b/>
           <w:bCs/>
           <w:sz w:val="22"/>
@@ -1528,7 +1579,7 @@
       </w:r>
       <w:r>
         <w:rPr>
-          <w:rFonts w:ascii="Arial" w:hAnsi="Arial" w:cs="Arial"/>
+          <w:rFonts w:ascii="Helvetica Neue" w:hAnsi="Helvetica Neue" w:cs="Arial"/>
           <w:sz w:val="22"/>
           <w:szCs w:val="22"/>
         </w:rPr>
@@ -1538,14 +1589,14 @@
     <w:p>
       <w:pPr>
         <w:rPr>
-          <w:rFonts w:ascii="Arial" w:hAnsi="Arial" w:cs="Arial"/>
-          <w:sz w:val="22"/>
-          <w:szCs w:val="22"/>
-        </w:rPr>
-      </w:pPr>
-      <w:r>
-        <w:rPr>
-          <w:rFonts w:ascii="Arial" w:hAnsi="Arial" w:cs="Arial"/>
+          <w:rFonts w:ascii="Helvetica Neue" w:hAnsi="Helvetica Neue" w:cs="Arial"/>
+          <w:sz w:val="22"/>
+          <w:szCs w:val="22"/>
+        </w:rPr>
+      </w:pPr>
+      <w:r>
+        <w:rPr>
+          <w:rFonts w:ascii="Helvetica Neue" w:hAnsi="Helvetica Neue" w:cs="Arial"/>
           <w:sz w:val="22"/>
           <w:szCs w:val="22"/>
         </w:rPr>
@@ -1556,14 +1607,14 @@
       <w:pPr>
         <w:ind w:left="720"/>
         <w:rPr>
-          <w:rFonts w:ascii="Arial" w:hAnsi="Arial" w:cs="Arial"/>
-          <w:sz w:val="22"/>
-          <w:szCs w:val="22"/>
-        </w:rPr>
-      </w:pPr>
-      <w:r>
-        <w:rPr>
-          <w:rFonts w:ascii="Arial" w:hAnsi="Arial" w:cs="Arial"/>
+          <w:rFonts w:ascii="Helvetica Neue" w:hAnsi="Helvetica Neue" w:cs="Arial"/>
+          <w:sz w:val="22"/>
+          <w:szCs w:val="22"/>
+        </w:rPr>
+      </w:pPr>
+      <w:r>
+        <w:rPr>
+          <w:rFonts w:ascii="Helvetica Neue" w:hAnsi="Helvetica Neue" w:cs="Arial"/>
           <w:sz w:val="22"/>
           <w:szCs w:val="22"/>
         </w:rPr>
@@ -1571,7 +1622,7 @@
       </w:r>
       <w:r>
         <w:rPr>
-          <w:rFonts w:ascii="Arial" w:hAnsi="Arial" w:cs="Arial"/>
+          <w:rFonts w:ascii="Helvetica Neue" w:hAnsi="Helvetica Neue" w:cs="Arial"/>
           <w:sz w:val="22"/>
           <w:szCs w:val="22"/>
         </w:rPr>
@@ -1579,7 +1630,7 @@
       </w:r>
       <w:r>
         <w:rPr>
-          <w:rFonts w:ascii="Arial" w:hAnsi="Arial" w:cs="Arial"/>
+          <w:rFonts w:ascii="Helvetica Neue" w:hAnsi="Helvetica Neue" w:cs="Arial"/>
           <w:sz w:val="22"/>
           <w:szCs w:val="22"/>
         </w:rPr>
@@ -1587,7 +1638,7 @@
       </w:r>
       <w:r>
         <w:rPr>
-          <w:rFonts w:ascii="Arial" w:hAnsi="Arial" w:cs="Arial"/>
+          <w:rFonts w:ascii="Helvetica Neue" w:hAnsi="Helvetica Neue" w:cs="Arial"/>
           <w:sz w:val="22"/>
           <w:szCs w:val="22"/>
         </w:rPr>
@@ -1595,7 +1646,7 @@
       </w:r>
       <w:r>
         <w:rPr>
-          <w:rFonts w:ascii="Arial" w:hAnsi="Arial" w:cs="Arial"/>
+          <w:rFonts w:ascii="Helvetica Neue" w:hAnsi="Helvetica Neue" w:cs="Arial"/>
           <w:sz w:val="22"/>
           <w:szCs w:val="22"/>
         </w:rPr>
@@ -1603,7 +1654,7 @@
       </w:r>
       <w:r>
         <w:rPr>
-          <w:rFonts w:ascii="Arial" w:hAnsi="Arial" w:cs="Arial"/>
+          <w:rFonts w:ascii="Helvetica Neue" w:hAnsi="Helvetica Neue" w:cs="Arial"/>
           <w:sz w:val="22"/>
           <w:szCs w:val="22"/>
         </w:rPr>
@@ -1611,7 +1662,7 @@
       </w:r>
       <w:r>
         <w:rPr>
-          <w:rFonts w:ascii="Arial" w:hAnsi="Arial" w:cs="Arial"/>
+          <w:rFonts w:ascii="Helvetica Neue" w:hAnsi="Helvetica Neue" w:cs="Arial"/>
           <w:sz w:val="22"/>
           <w:szCs w:val="22"/>
         </w:rPr>
@@ -1619,7 +1670,7 @@
       </w:r>
       <w:r>
         <w:rPr>
-          <w:rFonts w:ascii="Arial" w:hAnsi="Arial" w:cs="Arial"/>
+          <w:rFonts w:ascii="Helvetica Neue" w:hAnsi="Helvetica Neue" w:cs="Arial"/>
           <w:sz w:val="22"/>
           <w:szCs w:val="22"/>
         </w:rPr>
@@ -1627,7 +1678,7 @@
       </w:r>
       <w:r>
         <w:rPr>
-          <w:rFonts w:ascii="Arial" w:hAnsi="Arial" w:cs="Arial"/>
+          <w:rFonts w:ascii="Helvetica Neue" w:hAnsi="Helvetica Neue" w:cs="Arial"/>
           <w:sz w:val="22"/>
           <w:szCs w:val="22"/>
         </w:rPr>
@@ -1635,7 +1686,7 @@
       </w:r>
       <w:r>
         <w:rPr>
-          <w:rFonts w:ascii="Arial" w:hAnsi="Arial" w:cs="Arial"/>
+          <w:rFonts w:ascii="Helvetica Neue" w:hAnsi="Helvetica Neue" w:cs="Arial"/>
           <w:sz w:val="22"/>
           <w:szCs w:val="22"/>
         </w:rPr>
@@ -1643,7 +1694,7 @@
       </w:r>
       <w:r>
         <w:rPr>
-          <w:rFonts w:ascii="Arial" w:hAnsi="Arial" w:cs="Arial"/>
+          <w:rFonts w:ascii="Helvetica Neue" w:hAnsi="Helvetica Neue" w:cs="Arial"/>
           <w:sz w:val="22"/>
           <w:szCs w:val="22"/>
         </w:rPr>
@@ -1653,7 +1704,7 @@
     <w:p>
       <w:pPr>
         <w:rPr>
-          <w:rFonts w:ascii="Arial" w:hAnsi="Arial" w:cs="Arial"/>
+          <w:rFonts w:ascii="Helvetica Neue" w:hAnsi="Helvetica Neue" w:cs="Arial"/>
           <w:b/>
           <w:bCs/>
           <w:sz w:val="22"/>
@@ -1662,7 +1713,7 @@
       </w:pPr>
       <w:r>
         <w:rPr>
-          <w:rFonts w:ascii="Arial" w:hAnsi="Arial" w:cs="Arial"/>
+          <w:rFonts w:ascii="Helvetica Neue" w:hAnsi="Helvetica Neue" w:cs="Arial"/>
           <w:b/>
           <w:bCs/>
           <w:sz w:val="22"/>
@@ -1674,14 +1725,14 @@
     <w:p>
       <w:pPr>
         <w:rPr>
-          <w:rFonts w:ascii="Arial" w:hAnsi="Arial" w:cs="Arial"/>
-          <w:sz w:val="22"/>
-          <w:szCs w:val="22"/>
-        </w:rPr>
-      </w:pPr>
-      <w:r>
-        <w:rPr>
-          <w:rFonts w:ascii="Arial" w:hAnsi="Arial" w:cs="Arial"/>
+          <w:rFonts w:ascii="Helvetica Neue" w:hAnsi="Helvetica Neue" w:cs="Arial"/>
+          <w:sz w:val="22"/>
+          <w:szCs w:val="22"/>
+        </w:rPr>
+      </w:pPr>
+      <w:r>
+        <w:rPr>
+          <w:rFonts w:ascii="Helvetica Neue" w:hAnsi="Helvetica Neue" w:cs="Arial"/>
           <w:sz w:val="22"/>
           <w:szCs w:val="22"/>
         </w:rPr>
@@ -1691,14 +1742,14 @@
     <w:p>
       <w:pPr>
         <w:rPr>
-          <w:rFonts w:ascii="Arial" w:hAnsi="Arial" w:cs="Arial"/>
-          <w:sz w:val="22"/>
-          <w:szCs w:val="22"/>
-        </w:rPr>
-      </w:pPr>
-      <w:r>
-        <w:rPr>
-          <w:rFonts w:ascii="Arial" w:hAnsi="Arial" w:cs="Arial"/>
+          <w:rFonts w:ascii="Helvetica Neue" w:hAnsi="Helvetica Neue" w:cs="Arial"/>
+          <w:sz w:val="22"/>
+          <w:szCs w:val="22"/>
+        </w:rPr>
+      </w:pPr>
+      <w:r>
+        <w:rPr>
+          <w:rFonts w:ascii="Helvetica Neue" w:hAnsi="Helvetica Neue" w:cs="Arial"/>
           <w:sz w:val="22"/>
           <w:szCs w:val="22"/>
         </w:rPr>
@@ -1709,14 +1760,14 @@
       <w:pPr>
         <w:ind w:left="720"/>
         <w:rPr>
-          <w:rFonts w:ascii="Arial" w:hAnsi="Arial" w:cs="Arial"/>
-          <w:sz w:val="22"/>
-          <w:szCs w:val="22"/>
-        </w:rPr>
-      </w:pPr>
-      <w:r>
-        <w:rPr>
-          <w:rFonts w:ascii="Arial" w:hAnsi="Arial" w:cs="Arial"/>
+          <w:rFonts w:ascii="Helvetica Neue" w:hAnsi="Helvetica Neue" w:cs="Arial"/>
+          <w:sz w:val="22"/>
+          <w:szCs w:val="22"/>
+        </w:rPr>
+      </w:pPr>
+      <w:r>
+        <w:rPr>
+          <w:rFonts w:ascii="Helvetica Neue" w:hAnsi="Helvetica Neue" w:cs="Arial"/>
           <w:sz w:val="22"/>
           <w:szCs w:val="22"/>
         </w:rPr>
@@ -1724,7 +1775,7 @@
       </w:r>
       <w:r>
         <w:rPr>
-          <w:rFonts w:ascii="Arial" w:hAnsi="Arial" w:cs="Arial"/>
+          <w:rFonts w:ascii="Helvetica Neue" w:hAnsi="Helvetica Neue" w:cs="Arial"/>
           <w:sz w:val="22"/>
           <w:szCs w:val="22"/>
         </w:rPr>
@@ -1732,7 +1783,7 @@
       </w:r>
       <w:r>
         <w:rPr>
-          <w:rFonts w:ascii="Arial" w:hAnsi="Arial" w:cs="Arial"/>
+          <w:rFonts w:ascii="Helvetica Neue" w:hAnsi="Helvetica Neue" w:cs="Arial"/>
           <w:sz w:val="22"/>
           <w:szCs w:val="22"/>
         </w:rPr>
@@ -1740,7 +1791,7 @@
       </w:r>
       <w:r>
         <w:rPr>
-          <w:rFonts w:ascii="Arial" w:hAnsi="Arial" w:cs="Arial"/>
+          <w:rFonts w:ascii="Helvetica Neue" w:hAnsi="Helvetica Neue" w:cs="Arial"/>
           <w:sz w:val="22"/>
           <w:szCs w:val="22"/>
         </w:rPr>
@@ -1748,7 +1799,7 @@
       </w:r>
       <w:r>
         <w:rPr>
-          <w:rFonts w:ascii="Arial" w:hAnsi="Arial" w:cs="Arial"/>
+          <w:rFonts w:ascii="Helvetica Neue" w:hAnsi="Helvetica Neue" w:cs="Arial"/>
           <w:sz w:val="22"/>
           <w:szCs w:val="22"/>
         </w:rPr>
@@ -1756,7 +1807,7 @@
       </w:r>
       <w:r>
         <w:rPr>
-          <w:rFonts w:ascii="Arial" w:hAnsi="Arial" w:cs="Arial"/>
+          <w:rFonts w:ascii="Helvetica Neue" w:hAnsi="Helvetica Neue" w:cs="Arial"/>
           <w:sz w:val="22"/>
           <w:szCs w:val="22"/>
         </w:rPr>
@@ -1764,7 +1815,7 @@
       </w:r>
       <w:r>
         <w:rPr>
-          <w:rFonts w:ascii="Arial" w:hAnsi="Arial" w:cs="Arial"/>
+          <w:rFonts w:ascii="Helvetica Neue" w:hAnsi="Helvetica Neue" w:cs="Arial"/>
           <w:sz w:val="22"/>
           <w:szCs w:val="22"/>
         </w:rPr>
@@ -1772,7 +1823,7 @@
       </w:r>
       <w:r>
         <w:rPr>
-          <w:rFonts w:ascii="Arial" w:hAnsi="Arial" w:cs="Arial"/>
+          <w:rFonts w:ascii="Helvetica Neue" w:hAnsi="Helvetica Neue" w:cs="Arial"/>
           <w:sz w:val="22"/>
           <w:szCs w:val="22"/>
         </w:rPr>
@@ -1780,7 +1831,7 @@
       </w:r>
       <w:r>
         <w:rPr>
-          <w:rFonts w:ascii="Arial" w:hAnsi="Arial" w:cs="Arial"/>
+          <w:rFonts w:ascii="Helvetica Neue" w:hAnsi="Helvetica Neue" w:cs="Arial"/>
           <w:sz w:val="22"/>
           <w:szCs w:val="22"/>
         </w:rPr>
@@ -1788,7 +1839,7 @@
       </w:r>
       <w:r>
         <w:rPr>
-          <w:rFonts w:ascii="Arial" w:hAnsi="Arial" w:cs="Arial"/>
+          <w:rFonts w:ascii="Helvetica Neue" w:hAnsi="Helvetica Neue" w:cs="Arial"/>
           <w:sz w:val="22"/>
           <w:szCs w:val="22"/>
         </w:rPr>
@@ -1796,7 +1847,7 @@
       </w:r>
       <w:r>
         <w:rPr>
-          <w:rFonts w:ascii="Arial" w:hAnsi="Arial" w:cs="Arial"/>
+          <w:rFonts w:ascii="Helvetica Neue" w:hAnsi="Helvetica Neue" w:cs="Arial"/>
           <w:sz w:val="22"/>
           <w:szCs w:val="22"/>
         </w:rPr>
@@ -1804,7 +1855,7 @@
       </w:r>
       <w:r>
         <w:rPr>
-          <w:rFonts w:ascii="Arial" w:hAnsi="Arial" w:cs="Arial"/>
+          <w:rFonts w:ascii="Helvetica Neue" w:hAnsi="Helvetica Neue" w:cs="Arial"/>
           <w:sz w:val="22"/>
           <w:szCs w:val="22"/>
         </w:rPr>
@@ -1814,14 +1865,14 @@
     <w:p>
       <w:pPr>
         <w:rPr>
-          <w:rFonts w:ascii="Arial" w:hAnsi="Arial" w:cs="Arial"/>
-          <w:sz w:val="22"/>
-          <w:szCs w:val="22"/>
-        </w:rPr>
-      </w:pPr>
-      <w:r>
-        <w:rPr>
-          <w:rFonts w:ascii="Arial" w:hAnsi="Arial" w:cs="Arial"/>
+          <w:rFonts w:ascii="Helvetica Neue" w:hAnsi="Helvetica Neue" w:cs="Arial"/>
+          <w:sz w:val="22"/>
+          <w:szCs w:val="22"/>
+        </w:rPr>
+      </w:pPr>
+      <w:r>
+        <w:rPr>
+          <w:rFonts w:ascii="Helvetica Neue" w:hAnsi="Helvetica Neue" w:cs="Arial"/>
           <w:sz w:val="22"/>
           <w:szCs w:val="22"/>
         </w:rPr>
@@ -1831,7 +1882,7 @@
     <w:p>
       <w:pPr>
         <w:rPr>
-          <w:rFonts w:ascii="Arial" w:hAnsi="Arial" w:cs="Arial"/>
+          <w:rFonts w:ascii="Helvetica Neue" w:hAnsi="Helvetica Neue" w:cs="Arial"/>
           <w:b/>
           <w:bCs/>
           <w:sz w:val="22"/>
@@ -1840,7 +1891,7 @@
       </w:pPr>
       <w:r>
         <w:rPr>
-          <w:rFonts w:ascii="Arial" w:hAnsi="Arial" w:cs="Arial"/>
+          <w:rFonts w:ascii="Helvetica Neue" w:hAnsi="Helvetica Neue" w:cs="Arial"/>
           <w:b/>
           <w:bCs/>
           <w:sz w:val="22"/>
@@ -1852,14 +1903,14 @@
     <w:p>
       <w:pPr>
         <w:rPr>
-          <w:rFonts w:ascii="Arial" w:hAnsi="Arial" w:cs="Arial"/>
-          <w:sz w:val="22"/>
-          <w:szCs w:val="22"/>
-        </w:rPr>
-      </w:pPr>
-      <w:r>
-        <w:rPr>
-          <w:rFonts w:ascii="Arial" w:hAnsi="Arial" w:cs="Arial"/>
+          <w:rFonts w:ascii="Helvetica Neue" w:hAnsi="Helvetica Neue" w:cs="Arial"/>
+          <w:sz w:val="22"/>
+          <w:szCs w:val="22"/>
+        </w:rPr>
+      </w:pPr>
+      <w:r>
+        <w:rPr>
+          <w:rFonts w:ascii="Helvetica Neue" w:hAnsi="Helvetica Neue" w:cs="Arial"/>
           <w:sz w:val="22"/>
           <w:szCs w:val="22"/>
         </w:rPr>
@@ -1870,14 +1921,14 @@
       <w:pPr>
         <w:ind w:left="720"/>
         <w:rPr>
-          <w:rFonts w:ascii="Arial" w:hAnsi="Arial" w:cs="Arial"/>
-          <w:sz w:val="22"/>
-          <w:szCs w:val="22"/>
-        </w:rPr>
-      </w:pPr>
-      <w:r>
-        <w:rPr>
-          <w:rFonts w:ascii="Arial" w:hAnsi="Arial" w:cs="Arial"/>
+          <w:rFonts w:ascii="Helvetica Neue" w:hAnsi="Helvetica Neue" w:cs="Arial"/>
+          <w:sz w:val="22"/>
+          <w:szCs w:val="22"/>
+        </w:rPr>
+      </w:pPr>
+      <w:r>
+        <w:rPr>
+          <w:rFonts w:ascii="Helvetica Neue" w:hAnsi="Helvetica Neue" w:cs="Arial"/>
           <w:sz w:val="22"/>
           <w:szCs w:val="22"/>
         </w:rPr>
@@ -1885,7 +1936,7 @@
       </w:r>
       <w:r>
         <w:rPr>
-          <w:rFonts w:ascii="Arial" w:hAnsi="Arial" w:cs="Arial"/>
+          <w:rFonts w:ascii="Helvetica Neue" w:hAnsi="Helvetica Neue" w:cs="Arial"/>
           <w:sz w:val="22"/>
           <w:szCs w:val="22"/>
         </w:rPr>
@@ -1893,7 +1944,7 @@
       </w:r>
       <w:r>
         <w:rPr>
-          <w:rFonts w:ascii="Arial" w:hAnsi="Arial" w:cs="Arial"/>
+          <w:rFonts w:ascii="Helvetica Neue" w:hAnsi="Helvetica Neue" w:cs="Arial"/>
           <w:sz w:val="22"/>
           <w:szCs w:val="22"/>
         </w:rPr>
@@ -1901,7 +1952,7 @@
       </w:r>
       <w:r>
         <w:rPr>
-          <w:rFonts w:ascii="Arial" w:hAnsi="Arial" w:cs="Arial"/>
+          <w:rFonts w:ascii="Helvetica Neue" w:hAnsi="Helvetica Neue" w:cs="Arial"/>
           <w:sz w:val="22"/>
           <w:szCs w:val="22"/>
         </w:rPr>
@@ -1909,7 +1960,7 @@
       </w:r>
       <w:r>
         <w:rPr>
-          <w:rFonts w:ascii="Arial" w:hAnsi="Arial" w:cs="Arial"/>
+          <w:rFonts w:ascii="Helvetica Neue" w:hAnsi="Helvetica Neue" w:cs="Arial"/>
           <w:sz w:val="22"/>
           <w:szCs w:val="22"/>
         </w:rPr>
@@ -1917,7 +1968,7 @@
       </w:r>
       <w:r>
         <w:rPr>
-          <w:rFonts w:ascii="Arial" w:hAnsi="Arial" w:cs="Arial"/>
+          <w:rFonts w:ascii="Helvetica Neue" w:hAnsi="Helvetica Neue" w:cs="Arial"/>
           <w:sz w:val="22"/>
           <w:szCs w:val="22"/>
         </w:rPr>
@@ -1925,7 +1976,7 @@
       </w:r>
       <w:r>
         <w:rPr>
-          <w:rFonts w:ascii="Arial" w:hAnsi="Arial" w:cs="Arial"/>
+          <w:rFonts w:ascii="Helvetica Neue" w:hAnsi="Helvetica Neue" w:cs="Arial"/>
           <w:sz w:val="22"/>
           <w:szCs w:val="22"/>
         </w:rPr>
@@ -1933,7 +1984,7 @@
       </w:r>
       <w:r>
         <w:rPr>
-          <w:rFonts w:ascii="Arial" w:hAnsi="Arial" w:cs="Arial"/>
+          <w:rFonts w:ascii="Helvetica Neue" w:hAnsi="Helvetica Neue" w:cs="Arial"/>
           <w:sz w:val="22"/>
           <w:szCs w:val="22"/>
         </w:rPr>
@@ -1943,14 +1994,14 @@
     <w:p>
       <w:pPr>
         <w:rPr>
-          <w:rFonts w:ascii="Arial" w:hAnsi="Arial" w:cs="Arial"/>
-          <w:sz w:val="22"/>
-          <w:szCs w:val="22"/>
-        </w:rPr>
-      </w:pPr>
-      <w:r>
-        <w:rPr>
-          <w:rFonts w:ascii="Arial" w:hAnsi="Arial" w:cs="Arial"/>
+          <w:rFonts w:ascii="Helvetica Neue" w:hAnsi="Helvetica Neue" w:cs="Arial"/>
+          <w:sz w:val="22"/>
+          <w:szCs w:val="22"/>
+        </w:rPr>
+      </w:pPr>
+      <w:r>
+        <w:rPr>
+          <w:rFonts w:ascii="Helvetica Neue" w:hAnsi="Helvetica Neue" w:cs="Arial"/>
           <w:sz w:val="22"/>
           <w:szCs w:val="22"/>
         </w:rPr>
@@ -1960,7 +2011,7 @@
     <w:p>
       <w:pPr>
         <w:rPr>
-          <w:rFonts w:ascii="Arial" w:hAnsi="Arial" w:cs="Arial"/>
+          <w:rFonts w:ascii="Helvetica Neue" w:hAnsi="Helvetica Neue" w:cs="Arial"/>
           <w:b/>
           <w:bCs/>
           <w:sz w:val="22"/>
@@ -1969,7 +2020,7 @@
       </w:pPr>
       <w:r>
         <w:rPr>
-          <w:rFonts w:ascii="Arial" w:hAnsi="Arial" w:cs="Arial"/>
+          <w:rFonts w:ascii="Helvetica Neue" w:hAnsi="Helvetica Neue" w:cs="Arial"/>
           <w:b/>
           <w:bCs/>
           <w:sz w:val="22"/>
@@ -1981,14 +2032,14 @@
     <w:p>
       <w:pPr>
         <w:rPr>
-          <w:rFonts w:ascii="Arial" w:hAnsi="Arial" w:cs="Arial"/>
-          <w:sz w:val="22"/>
-          <w:szCs w:val="22"/>
-        </w:rPr>
-      </w:pPr>
-      <w:r>
-        <w:rPr>
-          <w:rFonts w:ascii="Arial" w:hAnsi="Arial" w:cs="Arial"/>
+          <w:rFonts w:ascii="Helvetica Neue" w:hAnsi="Helvetica Neue" w:cs="Arial"/>
+          <w:sz w:val="22"/>
+          <w:szCs w:val="22"/>
+        </w:rPr>
+      </w:pPr>
+      <w:r>
+        <w:rPr>
+          <w:rFonts w:ascii="Helvetica Neue" w:hAnsi="Helvetica Neue" w:cs="Arial"/>
           <w:sz w:val="22"/>
           <w:szCs w:val="22"/>
         </w:rPr>
@@ -1998,7 +2049,7 @@
     <w:p>
       <w:pPr>
         <w:rPr>
-          <w:rFonts w:ascii="Arial" w:hAnsi="Arial" w:cs="Arial"/>
+          <w:rFonts w:ascii="Helvetica Neue" w:hAnsi="Helvetica Neue" w:cs="Arial"/>
           <w:b/>
           <w:bCs/>
           <w:sz w:val="22"/>
@@ -2007,7 +2058,7 @@
       </w:pPr>
       <w:r>
         <w:rPr>
-          <w:rFonts w:ascii="Arial" w:hAnsi="Arial" w:cs="Arial"/>
+          <w:rFonts w:ascii="Helvetica Neue" w:hAnsi="Helvetica Neue" w:cs="Arial"/>
           <w:b/>
           <w:bCs/>
           <w:sz w:val="22"/>
@@ -2020,14 +2071,14 @@
       <w:pPr>
         <w:ind w:left="720"/>
         <w:rPr>
-          <w:rFonts w:ascii="Arial" w:hAnsi="Arial" w:cs="Arial"/>
-          <w:sz w:val="22"/>
-          <w:szCs w:val="22"/>
-        </w:rPr>
-      </w:pPr>
-      <w:r>
-        <w:rPr>
-          <w:rFonts w:ascii="Arial" w:hAnsi="Arial" w:cs="Arial"/>
+          <w:rFonts w:ascii="Helvetica Neue" w:hAnsi="Helvetica Neue" w:cs="Arial"/>
+          <w:sz w:val="22"/>
+          <w:szCs w:val="22"/>
+        </w:rPr>
+      </w:pPr>
+      <w:r>
+        <w:rPr>
+          <w:rFonts w:ascii="Helvetica Neue" w:hAnsi="Helvetica Neue" w:cs="Arial"/>
           <w:sz w:val="22"/>
           <w:szCs w:val="22"/>
         </w:rPr>
@@ -2035,7 +2086,7 @@
       </w:r>
       <w:r>
         <w:rPr>
-          <w:rFonts w:ascii="Arial" w:hAnsi="Arial" w:cs="Arial"/>
+          <w:rFonts w:ascii="Helvetica Neue" w:hAnsi="Helvetica Neue" w:cs="Arial"/>
           <w:sz w:val="22"/>
           <w:szCs w:val="22"/>
         </w:rPr>
@@ -2043,7 +2094,7 @@
       </w:r>
       <w:r>
         <w:rPr>
-          <w:rFonts w:ascii="Arial" w:hAnsi="Arial" w:cs="Arial"/>
+          <w:rFonts w:ascii="Helvetica Neue" w:hAnsi="Helvetica Neue" w:cs="Arial"/>
           <w:sz w:val="22"/>
           <w:szCs w:val="22"/>
         </w:rPr>
@@ -2051,7 +2102,7 @@
       </w:r>
       <w:r>
         <w:rPr>
-          <w:rFonts w:ascii="Arial" w:hAnsi="Arial" w:cs="Arial"/>
+          <w:rFonts w:ascii="Helvetica Neue" w:hAnsi="Helvetica Neue" w:cs="Arial"/>
           <w:sz w:val="22"/>
           <w:szCs w:val="22"/>
         </w:rPr>
@@ -2059,7 +2110,7 @@
       </w:r>
       <w:r>
         <w:rPr>
-          <w:rFonts w:ascii="Arial" w:hAnsi="Arial" w:cs="Arial"/>
+          <w:rFonts w:ascii="Helvetica Neue" w:hAnsi="Helvetica Neue" w:cs="Arial"/>
           <w:sz w:val="22"/>
           <w:szCs w:val="22"/>
         </w:rPr>
@@ -2067,7 +2118,7 @@
       </w:r>
       <w:r>
         <w:rPr>
-          <w:rFonts w:ascii="Arial" w:hAnsi="Arial" w:cs="Arial"/>
+          <w:rFonts w:ascii="Helvetica Neue" w:hAnsi="Helvetica Neue" w:cs="Arial"/>
           <w:sz w:val="22"/>
           <w:szCs w:val="22"/>
         </w:rPr>
@@ -2075,7 +2126,7 @@
       </w:r>
       <w:r>
         <w:rPr>
-          <w:rFonts w:ascii="Arial" w:hAnsi="Arial" w:cs="Arial"/>
+          <w:rFonts w:ascii="Helvetica Neue" w:hAnsi="Helvetica Neue" w:cs="Arial"/>
           <w:sz w:val="22"/>
           <w:szCs w:val="22"/>
         </w:rPr>
@@ -2083,7 +2134,7 @@
       </w:r>
       <w:r>
         <w:rPr>
-          <w:rFonts w:ascii="Arial" w:hAnsi="Arial" w:cs="Arial"/>
+          <w:rFonts w:ascii="Helvetica Neue" w:hAnsi="Helvetica Neue" w:cs="Arial"/>
           <w:sz w:val="22"/>
           <w:szCs w:val="22"/>
         </w:rPr>
@@ -2093,7 +2144,7 @@
     <w:p>
       <w:pPr>
         <w:rPr>
-          <w:rFonts w:ascii="Arial" w:hAnsi="Arial" w:cs="Arial"/>
+          <w:rFonts w:ascii="Helvetica Neue" w:hAnsi="Helvetica Neue" w:cs="Arial"/>
           <w:b/>
           <w:bCs/>
           <w:sz w:val="22"/>
@@ -2102,7 +2153,7 @@
       </w:pPr>
       <w:r>
         <w:rPr>
-          <w:rFonts w:ascii="Arial" w:hAnsi="Arial" w:cs="Arial"/>
+          <w:rFonts w:ascii="Helvetica Neue" w:hAnsi="Helvetica Neue" w:cs="Arial"/>
           <w:b/>
           <w:bCs/>
           <w:sz w:val="22"/>
@@ -2114,14 +2165,14 @@
     <w:p>
       <w:pPr>
         <w:rPr>
-          <w:rFonts w:ascii="Arial" w:hAnsi="Arial" w:cs="Arial"/>
-          <w:sz w:val="22"/>
-          <w:szCs w:val="22"/>
-        </w:rPr>
-      </w:pPr>
-      <w:r>
-        <w:rPr>
-          <w:rFonts w:ascii="Arial" w:hAnsi="Arial" w:cs="Arial"/>
+          <w:rFonts w:ascii="Helvetica Neue" w:hAnsi="Helvetica Neue" w:cs="Arial"/>
+          <w:sz w:val="22"/>
+          <w:szCs w:val="22"/>
+        </w:rPr>
+      </w:pPr>
+      <w:r>
+        <w:rPr>
+          <w:rFonts w:ascii="Helvetica Neue" w:hAnsi="Helvetica Neue" w:cs="Arial"/>
           <w:sz w:val="22"/>
           <w:szCs w:val="22"/>
         </w:rPr>
@@ -2129,7 +2180,7 @@
       </w:r>
       <w:r>
         <w:rPr>
-          <w:rFonts w:ascii="Arial" w:hAnsi="Arial" w:cs="Arial"/>
+          <w:rFonts w:ascii="Helvetica Neue" w:hAnsi="Helvetica Neue" w:cs="Arial"/>
           <w:sz w:val="22"/>
           <w:szCs w:val="22"/>
         </w:rPr>
@@ -2139,7 +2190,7 @@
     <w:p>
       <w:pPr>
         <w:rPr>
-          <w:rFonts w:ascii="Arial" w:hAnsi="Arial" w:cs="Arial"/>
+          <w:rFonts w:ascii="Helvetica Neue" w:hAnsi="Helvetica Neue" w:cs="Arial"/>
           <w:b/>
           <w:bCs/>
           <w:sz w:val="22"/>
@@ -2148,7 +2199,7 @@
       </w:pPr>
       <w:r>
         <w:rPr>
-          <w:rFonts w:ascii="Arial" w:hAnsi="Arial" w:cs="Arial"/>
+          <w:rFonts w:ascii="Helvetica Neue" w:hAnsi="Helvetica Neue" w:cs="Arial"/>
           <w:b/>
           <w:bCs/>
           <w:sz w:val="22"/>
@@ -2160,14 +2211,14 @@
     <w:p>
       <w:pPr>
         <w:rPr>
-          <w:rFonts w:ascii="Arial" w:hAnsi="Arial" w:cs="Arial"/>
-          <w:sz w:val="22"/>
-          <w:szCs w:val="22"/>
-        </w:rPr>
-      </w:pPr>
-      <w:r>
-        <w:rPr>
-          <w:rFonts w:ascii="Arial" w:hAnsi="Arial" w:cs="Arial"/>
+          <w:rFonts w:ascii="Helvetica Neue" w:hAnsi="Helvetica Neue" w:cs="Arial"/>
+          <w:sz w:val="22"/>
+          <w:szCs w:val="22"/>
+        </w:rPr>
+      </w:pPr>
+      <w:r>
+        <w:rPr>
+          <w:rFonts w:ascii="Helvetica Neue" w:hAnsi="Helvetica Neue" w:cs="Arial"/>
           <w:sz w:val="22"/>
           <w:szCs w:val="22"/>
         </w:rPr>
@@ -2175,7 +2226,7 @@
       </w:r>
       <w:r>
         <w:rPr>
-          <w:rFonts w:ascii="Arial" w:hAnsi="Arial" w:cs="Arial"/>
+          <w:rFonts w:ascii="Helvetica Neue" w:hAnsi="Helvetica Neue" w:cs="Arial"/>
           <w:sz w:val="22"/>
           <w:szCs w:val="22"/>
         </w:rPr>
@@ -2185,24 +2236,42 @@
     <w:p>
       <w:pPr>
         <w:rPr>
-          <w:rFonts w:ascii="Arial" w:hAnsi="Arial" w:cs="Arial"/>
-          <w:sz w:val="22"/>
-          <w:szCs w:val="22"/>
-        </w:rPr>
-      </w:pPr>
-      <w:r>
-        <w:rPr>
-          <w:rFonts w:ascii="Arial" w:hAnsi="Arial" w:cs="Arial"/>
-          <w:sz w:val="22"/>
-          <w:szCs w:val="22"/>
-        </w:rPr>
-        <w:t>There is no elimination and no ranking—only final earned outcome.</w:t>
-      </w:r>
-    </w:p>
-    <w:p>
-      <w:pPr>
-        <w:rPr>
-          <w:rFonts w:ascii="Arial" w:hAnsi="Arial" w:cs="Arial"/>
+          <w:rFonts w:ascii="Helvetica Neue" w:hAnsi="Helvetica Neue" w:cs="Arial"/>
+          <w:sz w:val="22"/>
+          <w:szCs w:val="22"/>
+        </w:rPr>
+      </w:pPr>
+      <w:r>
+        <w:rPr>
+          <w:rFonts w:ascii="Helvetica Neue" w:hAnsi="Helvetica Neue" w:cs="Arial"/>
+          <w:sz w:val="22"/>
+          <w:szCs w:val="22"/>
+        </w:rPr>
+        <w:t xml:space="preserve">There </w:t>
+      </w:r>
+      <w:proofErr w:type="gramStart"/>
+      <w:r>
+        <w:rPr>
+          <w:rFonts w:ascii="Helvetica Neue" w:hAnsi="Helvetica Neue" w:cs="Arial"/>
+          <w:sz w:val="22"/>
+          <w:szCs w:val="22"/>
+        </w:rPr>
+        <w:t>is</w:t>
+      </w:r>
+      <w:proofErr w:type="gramEnd"/>
+      <w:r>
+        <w:rPr>
+          <w:rFonts w:ascii="Helvetica Neue" w:hAnsi="Helvetica Neue" w:cs="Arial"/>
+          <w:sz w:val="22"/>
+          <w:szCs w:val="22"/>
+        </w:rPr>
+        <w:t xml:space="preserve"> no elimination and no ranking—only final earned outcome.</w:t>
+      </w:r>
+    </w:p>
+    <w:p>
+      <w:pPr>
+        <w:rPr>
+          <w:rFonts w:ascii="Helvetica Neue" w:hAnsi="Helvetica Neue" w:cs="Arial"/>
           <w:b/>
           <w:bCs/>
           <w:sz w:val="22"/>
@@ -2211,7 +2280,7 @@
       </w:pPr>
       <w:r>
         <w:rPr>
-          <w:rFonts w:ascii="Arial" w:hAnsi="Arial" w:cs="Arial"/>
+          <w:rFonts w:ascii="Helvetica Neue" w:hAnsi="Helvetica Neue" w:cs="Arial"/>
           <w:b/>
           <w:bCs/>
           <w:sz w:val="22"/>
@@ -2223,14 +2292,14 @@
     <w:p>
       <w:pPr>
         <w:rPr>
-          <w:rFonts w:ascii="Arial" w:hAnsi="Arial" w:cs="Arial"/>
-          <w:sz w:val="22"/>
-          <w:szCs w:val="22"/>
-        </w:rPr>
-      </w:pPr>
-      <w:r>
-        <w:rPr>
-          <w:rFonts w:ascii="Arial" w:hAnsi="Arial" w:cs="Arial"/>
+          <w:rFonts w:ascii="Helvetica Neue" w:hAnsi="Helvetica Neue" w:cs="Arial"/>
+          <w:sz w:val="22"/>
+          <w:szCs w:val="22"/>
+        </w:rPr>
+      </w:pPr>
+      <w:r>
+        <w:rPr>
+          <w:rFonts w:ascii="Helvetica Neue" w:hAnsi="Helvetica Neue" w:cs="Arial"/>
           <w:sz w:val="22"/>
           <w:szCs w:val="22"/>
         </w:rPr>
@@ -2241,14 +2310,14 @@
       <w:pPr>
         <w:ind w:left="720"/>
         <w:rPr>
-          <w:rFonts w:ascii="Arial" w:hAnsi="Arial" w:cs="Arial"/>
-          <w:sz w:val="22"/>
-          <w:szCs w:val="22"/>
-        </w:rPr>
-      </w:pPr>
-      <w:r>
-        <w:rPr>
-          <w:rFonts w:ascii="Arial" w:hAnsi="Arial" w:cs="Arial"/>
+          <w:rFonts w:ascii="Helvetica Neue" w:hAnsi="Helvetica Neue" w:cs="Arial"/>
+          <w:sz w:val="22"/>
+          <w:szCs w:val="22"/>
+        </w:rPr>
+      </w:pPr>
+      <w:r>
+        <w:rPr>
+          <w:rFonts w:ascii="Helvetica Neue" w:hAnsi="Helvetica Neue" w:cs="Arial"/>
           <w:sz w:val="22"/>
           <w:szCs w:val="22"/>
         </w:rPr>
@@ -2256,7 +2325,7 @@
       </w:r>
       <w:r>
         <w:rPr>
-          <w:rFonts w:ascii="Arial" w:hAnsi="Arial" w:cs="Arial"/>
+          <w:rFonts w:ascii="Helvetica Neue" w:hAnsi="Helvetica Neue" w:cs="Arial"/>
           <w:sz w:val="22"/>
           <w:szCs w:val="22"/>
         </w:rPr>
@@ -2264,7 +2333,7 @@
       </w:r>
       <w:r>
         <w:rPr>
-          <w:rFonts w:ascii="Arial" w:hAnsi="Arial" w:cs="Arial"/>
+          <w:rFonts w:ascii="Helvetica Neue" w:hAnsi="Helvetica Neue" w:cs="Arial"/>
           <w:sz w:val="22"/>
           <w:szCs w:val="22"/>
         </w:rPr>
@@ -2274,14 +2343,14 @@
     <w:p>
       <w:pPr>
         <w:rPr>
-          <w:rFonts w:ascii="Arial" w:hAnsi="Arial" w:cs="Arial"/>
-          <w:sz w:val="22"/>
-          <w:szCs w:val="22"/>
-        </w:rPr>
-      </w:pPr>
-      <w:r>
-        <w:rPr>
-          <w:rFonts w:ascii="Arial" w:hAnsi="Arial" w:cs="Arial"/>
+          <w:rFonts w:ascii="Helvetica Neue" w:hAnsi="Helvetica Neue" w:cs="Arial"/>
+          <w:sz w:val="22"/>
+          <w:szCs w:val="22"/>
+        </w:rPr>
+      </w:pPr>
+      <w:r>
+        <w:rPr>
+          <w:rFonts w:ascii="Helvetica Neue" w:hAnsi="Helvetica Neue" w:cs="Arial"/>
           <w:sz w:val="22"/>
           <w:szCs w:val="22"/>
         </w:rPr>
@@ -2293,14 +2362,14 @@
       <w:pPr>
         <w:ind w:left="720"/>
         <w:rPr>
-          <w:rFonts w:ascii="Arial" w:hAnsi="Arial" w:cs="Arial"/>
-          <w:sz w:val="22"/>
-          <w:szCs w:val="22"/>
-        </w:rPr>
-      </w:pPr>
-      <w:r>
-        <w:rPr>
-          <w:rFonts w:ascii="Arial" w:hAnsi="Arial" w:cs="Arial"/>
+          <w:rFonts w:ascii="Helvetica Neue" w:hAnsi="Helvetica Neue" w:cs="Arial"/>
+          <w:sz w:val="22"/>
+          <w:szCs w:val="22"/>
+        </w:rPr>
+      </w:pPr>
+      <w:r>
+        <w:rPr>
+          <w:rFonts w:ascii="Helvetica Neue" w:hAnsi="Helvetica Neue" w:cs="Arial"/>
           <w:sz w:val="22"/>
           <w:szCs w:val="22"/>
         </w:rPr>
@@ -2308,15 +2377,33 @@
       </w:r>
       <w:r>
         <w:rPr>
-          <w:rFonts w:ascii="Arial" w:hAnsi="Arial" w:cs="Arial"/>
-          <w:sz w:val="22"/>
-          <w:szCs w:val="22"/>
-        </w:rPr>
-        <w:t xml:space="preserve">Every decision changes future possibilities </w:t>
-      </w:r>
-      <w:r>
-        <w:rPr>
-          <w:rFonts w:ascii="Arial" w:hAnsi="Arial" w:cs="Arial"/>
+          <w:rFonts w:ascii="Helvetica Neue" w:hAnsi="Helvetica Neue" w:cs="Arial"/>
+          <w:sz w:val="22"/>
+          <w:szCs w:val="22"/>
+        </w:rPr>
+        <w:t xml:space="preserve">Every decision </w:t>
+      </w:r>
+      <w:proofErr w:type="gramStart"/>
+      <w:r>
+        <w:rPr>
+          <w:rFonts w:ascii="Helvetica Neue" w:hAnsi="Helvetica Neue" w:cs="Arial"/>
+          <w:sz w:val="22"/>
+          <w:szCs w:val="22"/>
+        </w:rPr>
+        <w:t>changes</w:t>
+      </w:r>
+      <w:proofErr w:type="gramEnd"/>
+      <w:r>
+        <w:rPr>
+          <w:rFonts w:ascii="Helvetica Neue" w:hAnsi="Helvetica Neue" w:cs="Arial"/>
+          <w:sz w:val="22"/>
+          <w:szCs w:val="22"/>
+        </w:rPr>
+        <w:t xml:space="preserve"> future possibilities </w:t>
+      </w:r>
+      <w:r>
+        <w:rPr>
+          <w:rFonts w:ascii="Helvetica Neue" w:hAnsi="Helvetica Neue" w:cs="Arial"/>
           <w:sz w:val="22"/>
           <w:szCs w:val="22"/>
         </w:rPr>
@@ -2324,7 +2411,7 @@
       </w:r>
       <w:r>
         <w:rPr>
-          <w:rFonts w:ascii="Arial" w:hAnsi="Arial" w:cs="Arial"/>
+          <w:rFonts w:ascii="Helvetica Neue" w:hAnsi="Helvetica Neue" w:cs="Arial"/>
           <w:sz w:val="22"/>
           <w:szCs w:val="22"/>
         </w:rPr>
@@ -2332,7 +2419,7 @@
       </w:r>
       <w:r>
         <w:rPr>
-          <w:rFonts w:ascii="Arial" w:hAnsi="Arial" w:cs="Arial"/>
+          <w:rFonts w:ascii="Helvetica Neue" w:hAnsi="Helvetica Neue" w:cs="Arial"/>
           <w:sz w:val="22"/>
           <w:szCs w:val="22"/>
         </w:rPr>
@@ -2340,7 +2427,7 @@
       </w:r>
       <w:r>
         <w:rPr>
-          <w:rFonts w:ascii="Arial" w:hAnsi="Arial" w:cs="Arial"/>
+          <w:rFonts w:ascii="Helvetica Neue" w:hAnsi="Helvetica Neue" w:cs="Arial"/>
           <w:sz w:val="22"/>
           <w:szCs w:val="22"/>
         </w:rPr>
@@ -2348,7 +2435,7 @@
       </w:r>
       <w:r>
         <w:rPr>
-          <w:rFonts w:ascii="Arial" w:hAnsi="Arial" w:cs="Arial"/>
+          <w:rFonts w:ascii="Helvetica Neue" w:hAnsi="Helvetica Neue" w:cs="Arial"/>
           <w:sz w:val="22"/>
           <w:szCs w:val="22"/>
         </w:rPr>
@@ -2356,7 +2443,7 @@
       </w:r>
       <w:r>
         <w:rPr>
-          <w:rFonts w:ascii="Arial" w:hAnsi="Arial" w:cs="Arial"/>
+          <w:rFonts w:ascii="Helvetica Neue" w:hAnsi="Helvetica Neue" w:cs="Arial"/>
           <w:sz w:val="22"/>
           <w:szCs w:val="22"/>
         </w:rPr>
@@ -2364,7 +2451,7 @@
       </w:r>
       <w:r>
         <w:rPr>
-          <w:rFonts w:ascii="Arial" w:hAnsi="Arial" w:cs="Arial"/>
+          <w:rFonts w:ascii="Helvetica Neue" w:hAnsi="Helvetica Neue" w:cs="Arial"/>
           <w:sz w:val="22"/>
           <w:szCs w:val="22"/>
         </w:rPr>
@@ -2372,7 +2459,7 @@
       </w:r>
       <w:r>
         <w:rPr>
-          <w:rFonts w:ascii="Arial" w:hAnsi="Arial" w:cs="Arial"/>
+          <w:rFonts w:ascii="Helvetica Neue" w:hAnsi="Helvetica Neue" w:cs="Arial"/>
           <w:sz w:val="22"/>
           <w:szCs w:val="22"/>
         </w:rPr>
@@ -2380,7 +2467,7 @@
       </w:r>
       <w:r>
         <w:rPr>
-          <w:rFonts w:ascii="Arial" w:hAnsi="Arial" w:cs="Arial"/>
+          <w:rFonts w:ascii="Helvetica Neue" w:hAnsi="Helvetica Neue" w:cs="Arial"/>
           <w:sz w:val="22"/>
           <w:szCs w:val="22"/>
         </w:rPr>
@@ -2388,7 +2475,7 @@
       </w:r>
       <w:r>
         <w:rPr>
-          <w:rFonts w:ascii="Arial" w:hAnsi="Arial" w:cs="Arial"/>
+          <w:rFonts w:ascii="Helvetica Neue" w:hAnsi="Helvetica Neue" w:cs="Arial"/>
           <w:sz w:val="22"/>
           <w:szCs w:val="22"/>
         </w:rPr>
@@ -2396,7 +2483,7 @@
       </w:r>
       <w:r>
         <w:rPr>
-          <w:rFonts w:ascii="Arial" w:hAnsi="Arial" w:cs="Arial"/>
+          <w:rFonts w:ascii="Helvetica Neue" w:hAnsi="Helvetica Neue" w:cs="Arial"/>
           <w:sz w:val="22"/>
           <w:szCs w:val="22"/>
         </w:rPr>
@@ -2404,7 +2491,7 @@
       </w:r>
       <w:r>
         <w:rPr>
-          <w:rFonts w:ascii="Arial" w:hAnsi="Arial" w:cs="Arial"/>
+          <w:rFonts w:ascii="Helvetica Neue" w:hAnsi="Helvetica Neue" w:cs="Arial"/>
           <w:sz w:val="22"/>
           <w:szCs w:val="22"/>
         </w:rPr>
@@ -2412,7 +2499,7 @@
       </w:r>
       <w:r>
         <w:rPr>
-          <w:rFonts w:ascii="Arial" w:hAnsi="Arial" w:cs="Arial"/>
+          <w:rFonts w:ascii="Helvetica Neue" w:hAnsi="Helvetica Neue" w:cs="Arial"/>
           <w:sz w:val="22"/>
           <w:szCs w:val="22"/>
         </w:rPr>
@@ -2420,7 +2507,7 @@
       </w:r>
       <w:r>
         <w:rPr>
-          <w:rFonts w:ascii="Arial" w:hAnsi="Arial" w:cs="Arial"/>
+          <w:rFonts w:ascii="Helvetica Neue" w:hAnsi="Helvetica Neue" w:cs="Arial"/>
           <w:sz w:val="22"/>
           <w:szCs w:val="22"/>
         </w:rPr>
@@ -2428,7 +2515,7 @@
       </w:r>
       <w:r>
         <w:rPr>
-          <w:rFonts w:ascii="Arial" w:hAnsi="Arial" w:cs="Arial"/>
+          <w:rFonts w:ascii="Helvetica Neue" w:hAnsi="Helvetica Neue" w:cs="Arial"/>
           <w:sz w:val="22"/>
           <w:szCs w:val="22"/>
         </w:rPr>
@@ -2438,14 +2525,14 @@
     <w:p>
       <w:pPr>
         <w:rPr>
-          <w:rFonts w:ascii="Arial" w:hAnsi="Arial" w:cs="Arial"/>
-          <w:sz w:val="22"/>
-          <w:szCs w:val="22"/>
-        </w:rPr>
-      </w:pPr>
-      <w:r>
-        <w:rPr>
-          <w:rFonts w:ascii="Arial" w:hAnsi="Arial" w:cs="Arial"/>
+          <w:rFonts w:ascii="Helvetica Neue" w:hAnsi="Helvetica Neue" w:cs="Arial"/>
+          <w:sz w:val="22"/>
+          <w:szCs w:val="22"/>
+        </w:rPr>
+      </w:pPr>
+      <w:r>
+        <w:rPr>
+          <w:rFonts w:ascii="Helvetica Neue" w:hAnsi="Helvetica Neue" w:cs="Arial"/>
           <w:sz w:val="22"/>
           <w:szCs w:val="22"/>
         </w:rPr>
@@ -2456,14 +2543,14 @@
       <w:pPr>
         <w:ind w:left="720"/>
         <w:rPr>
-          <w:rFonts w:ascii="Arial" w:hAnsi="Arial" w:cs="Arial"/>
-          <w:sz w:val="22"/>
-          <w:szCs w:val="22"/>
-        </w:rPr>
-      </w:pPr>
-      <w:r>
-        <w:rPr>
-          <w:rFonts w:ascii="Arial" w:hAnsi="Arial" w:cs="Arial"/>
+          <w:rFonts w:ascii="Helvetica Neue" w:hAnsi="Helvetica Neue" w:cs="Arial"/>
+          <w:sz w:val="22"/>
+          <w:szCs w:val="22"/>
+        </w:rPr>
+      </w:pPr>
+      <w:r>
+        <w:rPr>
+          <w:rFonts w:ascii="Helvetica Neue" w:hAnsi="Helvetica Neue" w:cs="Arial"/>
           <w:sz w:val="22"/>
           <w:szCs w:val="22"/>
         </w:rPr>
@@ -2473,7 +2560,7 @@
     <w:p>
       <w:pPr>
         <w:rPr>
-          <w:rFonts w:ascii="Arial" w:hAnsi="Arial" w:cs="Arial"/>
+          <w:rFonts w:ascii="Helvetica Neue" w:hAnsi="Helvetica Neue" w:cs="Arial"/>
           <w:b/>
           <w:bCs/>
           <w:sz w:val="22"/>
@@ -2482,7 +2569,7 @@
       </w:pPr>
       <w:r>
         <w:rPr>
-          <w:rFonts w:ascii="Arial" w:hAnsi="Arial" w:cs="Arial"/>
+          <w:rFonts w:ascii="Helvetica Neue" w:hAnsi="Helvetica Neue" w:cs="Arial"/>
           <w:b/>
           <w:bCs/>
           <w:sz w:val="22"/>
@@ -2492,7 +2579,7 @@
       </w:r>
       <w:r>
         <w:rPr>
-          <w:rFonts w:ascii="Arial" w:hAnsi="Arial" w:cs="Arial"/>
+          <w:rFonts w:ascii="Helvetica Neue" w:hAnsi="Helvetica Neue" w:cs="Arial"/>
           <w:b/>
           <w:bCs/>
           <w:sz w:val="22"/>
@@ -2504,14 +2591,14 @@
     <w:p>
       <w:pPr>
         <w:rPr>
-          <w:rFonts w:ascii="Arial" w:hAnsi="Arial" w:cs="Arial"/>
-          <w:sz w:val="22"/>
-          <w:szCs w:val="22"/>
-        </w:rPr>
-      </w:pPr>
-      <w:r>
-        <w:rPr>
-          <w:rFonts w:ascii="Arial" w:hAnsi="Arial" w:cs="Arial"/>
+          <w:rFonts w:ascii="Helvetica Neue" w:hAnsi="Helvetica Neue" w:cs="Arial"/>
+          <w:sz w:val="22"/>
+          <w:szCs w:val="22"/>
+        </w:rPr>
+      </w:pPr>
+      <w:r>
+        <w:rPr>
+          <w:rFonts w:ascii="Helvetica Neue" w:hAnsi="Helvetica Neue" w:cs="Arial"/>
           <w:sz w:val="22"/>
           <w:szCs w:val="22"/>
         </w:rPr>
@@ -2521,7 +2608,7 @@
     <w:p>
       <w:pPr>
         <w:rPr>
-          <w:rFonts w:ascii="Arial" w:hAnsi="Arial" w:cs="Arial"/>
+          <w:rFonts w:ascii="Helvetica Neue" w:hAnsi="Helvetica Neue" w:cs="Arial"/>
           <w:sz w:val="22"/>
           <w:szCs w:val="22"/>
         </w:rPr>
@@ -2536,7 +2623,7 @@
       </w:r>
       <w:r>
         <w:rPr>
-          <w:rFonts w:ascii="Arial" w:hAnsi="Arial" w:cs="Arial"/>
+          <w:rFonts w:ascii="Helvetica Neue" w:hAnsi="Helvetica Neue" w:cs="Arial"/>
           <w:sz w:val="22"/>
           <w:szCs w:val="22"/>
         </w:rPr>
@@ -2546,7 +2633,7 @@
         <w:r>
           <w:rPr>
             <w:rStyle w:val="Hyperlink"/>
-            <w:rFonts w:ascii="Arial" w:hAnsi="Arial" w:cs="Arial"/>
+            <w:rFonts w:ascii="Helvetica Neue" w:hAnsi="Helvetica Neue" w:cs="Arial"/>
             <w:sz w:val="22"/>
             <w:szCs w:val="22"/>
           </w:rPr>
@@ -2557,7 +2644,7 @@
     <w:p>
       <w:pPr>
         <w:rPr>
-          <w:rFonts w:ascii="Arial" w:hAnsi="Arial" w:cs="Arial"/>
+          <w:rFonts w:ascii="Helvetica Neue" w:hAnsi="Helvetica Neue" w:cs="Arial"/>
           <w:b/>
           <w:bCs/>
           <w:sz w:val="22"/>
@@ -2566,7 +2653,7 @@
       </w:pPr>
       <w:r>
         <w:rPr>
-          <w:rFonts w:ascii="Arial" w:hAnsi="Arial" w:cs="Arial"/>
+          <w:rFonts w:ascii="Helvetica Neue" w:hAnsi="Helvetica Neue" w:cs="Arial"/>
           <w:b/>
           <w:bCs/>
           <w:sz w:val="22"/>
@@ -2578,14 +2665,14 @@
     <w:p>
       <w:pPr>
         <w:rPr>
-          <w:rFonts w:ascii="Arial" w:hAnsi="Arial" w:cs="Arial"/>
-          <w:sz w:val="22"/>
-          <w:szCs w:val="22"/>
-        </w:rPr>
-      </w:pPr>
-      <w:r>
-        <w:rPr>
-          <w:rFonts w:ascii="Arial" w:hAnsi="Arial" w:cs="Arial"/>
+          <w:rFonts w:ascii="Helvetica Neue" w:hAnsi="Helvetica Neue" w:cs="Arial"/>
+          <w:sz w:val="22"/>
+          <w:szCs w:val="22"/>
+        </w:rPr>
+      </w:pPr>
+      <w:r>
+        <w:rPr>
+          <w:rFonts w:ascii="Helvetica Neue" w:hAnsi="Helvetica Neue" w:cs="Arial"/>
           <w:sz w:val="22"/>
           <w:szCs w:val="22"/>
         </w:rPr>
@@ -2593,7 +2680,7 @@
       </w:r>
       <w:r>
         <w:rPr>
-          <w:rFonts w:ascii="Arial" w:hAnsi="Arial" w:cs="Arial"/>
+          <w:rFonts w:ascii="Helvetica Neue" w:hAnsi="Helvetica Neue" w:cs="Arial"/>
           <w:sz w:val="22"/>
           <w:szCs w:val="22"/>
         </w:rPr>
@@ -2604,14 +2691,14 @@
     <w:p>
       <w:pPr>
         <w:rPr>
-          <w:rFonts w:ascii="Arial" w:hAnsi="Arial" w:cs="Arial"/>
-          <w:sz w:val="22"/>
-          <w:szCs w:val="22"/>
-        </w:rPr>
-      </w:pPr>
-      <w:r>
-        <w:rPr>
-          <w:rFonts w:ascii="Arial" w:hAnsi="Arial" w:cs="Arial"/>
+          <w:rFonts w:ascii="Helvetica Neue" w:hAnsi="Helvetica Neue" w:cs="Arial"/>
+          <w:sz w:val="22"/>
+          <w:szCs w:val="22"/>
+        </w:rPr>
+      </w:pPr>
+      <w:r>
+        <w:rPr>
+          <w:rFonts w:ascii="Helvetica Neue" w:hAnsi="Helvetica Neue" w:cs="Arial"/>
           <w:b/>
           <w:bCs/>
           <w:sz w:val="22"/>
@@ -2621,7 +2708,7 @@
       </w:r>
       <w:r>
         <w:rPr>
-          <w:rFonts w:ascii="Arial" w:hAnsi="Arial" w:cs="Arial"/>
+          <w:rFonts w:ascii="Helvetica Neue" w:hAnsi="Helvetica Neue" w:cs="Arial"/>
           <w:b/>
           <w:bCs/>
           <w:sz w:val="22"/>
@@ -2631,7 +2718,7 @@
       </w:r>
       <w:r>
         <w:rPr>
-          <w:rFonts w:ascii="Arial" w:hAnsi="Arial" w:cs="Arial"/>
+          <w:rFonts w:ascii="Helvetica Neue" w:hAnsi="Helvetica Neue" w:cs="Arial"/>
           <w:sz w:val="22"/>
           <w:szCs w:val="22"/>
         </w:rPr>
@@ -2639,7 +2726,7 @@
       </w:r>
       <w:r>
         <w:rPr>
-          <w:rFonts w:ascii="Arial" w:hAnsi="Arial" w:cs="Arial"/>
+          <w:rFonts w:ascii="Helvetica Neue" w:hAnsi="Helvetica Neue" w:cs="Arial"/>
           <w:sz w:val="22"/>
           <w:szCs w:val="22"/>
         </w:rPr>
@@ -2650,7 +2737,7 @@
         <w:r>
           <w:rPr>
             <w:rStyle w:val="Hyperlink"/>
-            <w:rFonts w:ascii="Arial" w:hAnsi="Arial" w:cs="Arial"/>
+            <w:rFonts w:ascii="Helvetica Neue" w:hAnsi="Helvetica Neue" w:cs="Arial"/>
             <w:sz w:val="22"/>
             <w:szCs w:val="22"/>
           </w:rPr>
@@ -2659,7 +2746,7 @@
       </w:hyperlink>
       <w:r>
         <w:rPr>
-          <w:rFonts w:ascii="Arial" w:hAnsi="Arial" w:cs="Arial"/>
+          <w:rFonts w:ascii="Helvetica Neue" w:hAnsi="Helvetica Neue" w:cs="Arial"/>
           <w:sz w:val="22"/>
           <w:szCs w:val="22"/>
         </w:rPr>
@@ -2667,7 +2754,7 @@
       </w:r>
       <w:r>
         <w:rPr>
-          <w:rFonts w:ascii="Arial" w:hAnsi="Arial" w:cs="Arial"/>
+          <w:rFonts w:ascii="Helvetica Neue" w:hAnsi="Helvetica Neue" w:cs="Arial"/>
           <w:sz w:val="22"/>
           <w:szCs w:val="22"/>
         </w:rPr>
@@ -2676,7 +2763,7 @@
       </w:r>
       <w:r>
         <w:rPr>
-          <w:rFonts w:ascii="Arial" w:hAnsi="Arial" w:cs="Arial"/>
+          <w:rFonts w:ascii="Helvetica Neue" w:hAnsi="Helvetica Neue" w:cs="Arial"/>
           <w:sz w:val="22"/>
           <w:szCs w:val="22"/>
         </w:rPr>
@@ -2687,7 +2774,7 @@
         <w:r>
           <w:rPr>
             <w:rStyle w:val="Hyperlink"/>
-            <w:rFonts w:ascii="Arial" w:hAnsi="Arial" w:cs="Arial"/>
+            <w:rFonts w:ascii="Helvetica Neue" w:hAnsi="Helvetica Neue" w:cs="Arial"/>
             <w:sz w:val="22"/>
             <w:szCs w:val="22"/>
           </w:rPr>
@@ -2696,7 +2783,7 @@
       </w:hyperlink>
       <w:r>
         <w:rPr>
-          <w:rFonts w:ascii="Arial" w:hAnsi="Arial" w:cs="Arial"/>
+          <w:rFonts w:ascii="Helvetica Neue" w:hAnsi="Helvetica Neue" w:cs="Arial"/>
           <w:sz w:val="22"/>
           <w:szCs w:val="22"/>
         </w:rPr>
@@ -2706,7 +2793,7 @@
     <w:p>
       <w:pPr>
         <w:rPr>
-          <w:rFonts w:ascii="Arial" w:hAnsi="Arial" w:cs="Arial"/>
+          <w:rFonts w:ascii="Helvetica Neue" w:hAnsi="Helvetica Neue" w:cs="Arial"/>
           <w:sz w:val="22"/>
           <w:szCs w:val="22"/>
         </w:rPr>
@@ -6230,6 +6317,15 @@
 </file>
 
 <file path=customXml/item1.xml><?xml version="1.0" encoding="utf-8"?>
+<?mso-contentType ?>
+<FormTemplates xmlns="http://schemas.microsoft.com/sharepoint/v3/contenttype/forms">
+  <Display>DocumentLibraryForm</Display>
+  <Edit>DocumentLibraryForm</Edit>
+  <New>DocumentLibraryForm</New>
+</FormTemplates>
+</file>
+
+<file path=customXml/item2.xml><?xml version="1.0" encoding="utf-8"?>
 <ct:contentTypeSchema xmlns:ct="http://schemas.microsoft.com/office/2006/metadata/contentType" xmlns:ma="http://schemas.microsoft.com/office/2006/metadata/properties/metaAttributes" ct:_="" ma:_="" ma:contentTypeName="Document" ma:contentTypeID="0x010100374E75D500A2FD47A63F0EB24E8640B6" ma:contentTypeVersion="12" ma:contentTypeDescription="Create a new document." ma:contentTypeScope="" ma:versionID="39ce955ef7f13ee95c9609b14f24550e">
   <xsd:schema xmlns:xsd="http://www.w3.org/2001/XMLSchema" xmlns:xs="http://www.w3.org/2001/XMLSchema" xmlns:p="http://schemas.microsoft.com/office/2006/metadata/properties" xmlns:ns1="http://schemas.microsoft.com/sharepoint/v3" xmlns:ns3="0d6cb13f-9229-4baf-92f6-6bb908896aca" targetNamespace="http://schemas.microsoft.com/office/2006/metadata/properties" ma:root="true" ma:fieldsID="32cba2f58b6476a5ee829b4ad9bd66fc" ns1:_="" ns3:_="">
     <xsd:import namespace="http://schemas.microsoft.com/sharepoint/v3"/>
@@ -6428,15 +6524,6 @@
 </ct:contentTypeSchema>
 </file>
 
-<file path=customXml/item2.xml><?xml version="1.0" encoding="utf-8"?>
-<?mso-contentType ?>
-<FormTemplates xmlns="http://schemas.microsoft.com/sharepoint/v3/contenttype/forms">
-  <Display>DocumentLibraryForm</Display>
-  <Edit>DocumentLibraryForm</Edit>
-  <New>DocumentLibraryForm</New>
-</FormTemplates>
-</file>
-
 <file path=customXml/item3.xml><?xml version="1.0" encoding="utf-8"?>
 <p:properties xmlns:p="http://schemas.microsoft.com/office/2006/metadata/properties" xmlns:xsi="http://www.w3.org/2001/XMLSchema-instance" xmlns:pc="http://schemas.microsoft.com/office/infopath/2007/PartnerControls">
   <documentManagement>
@@ -6448,6 +6535,14 @@
 </file>
 
 <file path=customXml/itemProps1.xml><?xml version="1.0" encoding="utf-8"?>
+<ds:datastoreItem xmlns:ds="http://schemas.openxmlformats.org/officeDocument/2006/customXml" ds:itemID="{5FB808EB-8502-42BC-BC05-3095F97B7DE4}">
+  <ds:schemaRefs>
+    <ds:schemaRef ds:uri="http://schemas.microsoft.com/sharepoint/v3/contenttype/forms"/>
+  </ds:schemaRefs>
+</ds:datastoreItem>
+</file>
+
+<file path=customXml/itemProps2.xml><?xml version="1.0" encoding="utf-8"?>
 <ds:datastoreItem xmlns:ds="http://schemas.openxmlformats.org/officeDocument/2006/customXml" ds:itemID="{881E27FE-2E2A-4475-98C2-E01816880782}">
   <ds:schemaRefs>
     <ds:schemaRef ds:uri="http://schemas.microsoft.com/office/2006/metadata/contentType"/>
@@ -6462,14 +6557,6 @@
     <ds:schemaRef ds:uri="http://purl.org/dc/elements/1.1/"/>
     <ds:schemaRef ds:uri="http://purl.org/dc/terms/"/>
     <ds:schemaRef ds:uri="http://schemas.microsoft.com/internal/obd"/>
-  </ds:schemaRefs>
-</ds:datastoreItem>
-</file>
-
-<file path=customXml/itemProps2.xml><?xml version="1.0" encoding="utf-8"?>
-<ds:datastoreItem xmlns:ds="http://schemas.openxmlformats.org/officeDocument/2006/customXml" ds:itemID="{5FB808EB-8502-42BC-BC05-3095F97B7DE4}">
-  <ds:schemaRefs>
-    <ds:schemaRef ds:uri="http://schemas.microsoft.com/sharepoint/v3/contenttype/forms"/>
   </ds:schemaRefs>
 </ds:datastoreItem>
 </file>

</xml_diff>